<commit_message>
Ship floor-app v1.8.9 + API v1.2.2: CII screen, CID format, 11 new schema models (#136/#196/#194)
New Container ID Inquiry screen with five container type views (Full Case, Overpack,
SSP Pull Master, SSP Unit, Stray Each), CID format parsing utility, merged event log,
and IM+ action modals (Cancel with cascade, Force Close/Reopen, Reassign Destination).
11 new database models, 6 new API endpoints, 3 new reason-code domains.

Co-Authored-By: Claude Opus 4.6 <noreply@anthropic.com>
</commit_message>
<xml_diff>
--- a/Documentation/PalletIQ-Manual-E2E-Checklist.docx
+++ b/Documentation/PalletIQ-Manual-E2E-Checklist.docx
@@ -2343,7 +2343,7 @@
               <w:rPr>
                 <w:sz w:val="18"/>
               </w:rPr>
-              <w:t>Unbuilt function buttons (OCC, PRQ, LRP, CII, WTP) show info message, no nav</w:t>
+              <w:t>CII button navigates to /container</w:t>
             </w:r>
           </w:p>
         </w:tc>
@@ -2392,6 +2392,55 @@
               <w:rPr>
                 <w:sz w:val="18"/>
               </w:rPr>
+              <w:t>Unbuilt function buttons (OCC, PRQ, LRP, WTP) show info message, no nav</w:t>
+            </w:r>
+          </w:p>
+        </w:tc>
+        <w:tc>
+          <w:tcPr>
+            <w:tcW w:type="dxa" w:w="1417"/>
+            <w:shd w:fill="F0F0F5" w:val="clear"/>
+          </w:tcPr>
+          <w:p>
+            <w:pPr>
+              <w:jc w:val="center"/>
+            </w:pPr>
+          </w:p>
+        </w:tc>
+        <w:tc>
+          <w:tcPr>
+            <w:tcW w:type="dxa" w:w="3402"/>
+            <w:shd w:fill="F0F0F5" w:val="clear"/>
+          </w:tcPr>
+          <w:p/>
+        </w:tc>
+      </w:tr>
+      <w:tr>
+        <w:tc>
+          <w:tcPr>
+            <w:tcW w:type="dxa" w:w="454"/>
+          </w:tcPr>
+          <w:p>
+            <w:pPr>
+              <w:jc w:val="center"/>
+            </w:pPr>
+            <w:r>
+              <w:rPr>
+                <w:sz w:val="18"/>
+              </w:rPr>
+              <w:t>19</w:t>
+            </w:r>
+          </w:p>
+        </w:tc>
+        <w:tc>
+          <w:tcPr>
+            <w:tcW w:type="dxa" w:w="9071"/>
+          </w:tcPr>
+          <w:p>
+            <w:r>
+              <w:rPr>
+                <w:sz w:val="18"/>
+              </w:rPr>
               <w:t>Every button shows jump code badge and function name</w:t>
             </w:r>
           </w:p>
@@ -2399,7 +2448,6 @@
         <w:tc>
           <w:tcPr>
             <w:tcW w:type="dxa" w:w="1417"/>
-            <w:shd w:fill="F0F0F5" w:val="clear"/>
           </w:tcPr>
           <w:p>
             <w:pPr>
@@ -2410,7 +2458,6 @@
         <w:tc>
           <w:tcPr>
             <w:tcW w:type="dxa" w:w="3402"/>
-            <w:shd w:fill="F0F0F5" w:val="clear"/>
           </w:tcPr>
           <w:p/>
         </w:tc>
@@ -15158,6 +15205,1593 @@
         <w:tc>
           <w:tcPr>
             <w:tcW w:type="dxa" w:w="3402"/>
+          </w:tcPr>
+          <w:p/>
+        </w:tc>
+      </w:tr>
+    </w:tbl>
+    <w:p>
+      <w:r>
+        <w:br w:type="page"/>
+      </w:r>
+    </w:p>
+    <w:p>
+      <w:pPr>
+        <w:pStyle w:val="Heading1"/>
+      </w:pPr>
+      <w:r>
+        <w:rPr>
+          <w:color w:val="1A1A2E"/>
+        </w:rPr>
+        <w:t>CII — Container ID Inquiry</w:t>
+      </w:r>
+    </w:p>
+    <w:p>
+      <w:r>
+        <w:rPr>
+          <w:sz w:val="18"/>
+        </w:rPr>
+        <w:t>Tester: ____________    Date: ____________    Version: ____________</w:t>
+      </w:r>
+    </w:p>
+    <w:tbl>
+      <w:tblPr>
+        <w:tblStyle w:val="TableGrid"/>
+        <w:tblW w:type="auto" w:w="0"/>
+        <w:jc w:val="center"/>
+        <w:tblLayout w:type="autofit"/>
+        <w:tblLook w:firstColumn="1" w:firstRow="1" w:lastColumn="0" w:lastRow="0" w:noHBand="0" w:noVBand="1" w:val="04A0"/>
+      </w:tblPr>
+      <w:tblGrid>
+        <w:gridCol w:w="454"/>
+        <w:gridCol w:w="9071"/>
+        <w:gridCol w:w="1417"/>
+        <w:gridCol w:w="3402"/>
+      </w:tblGrid>
+      <w:tr>
+        <w:tc>
+          <w:tcPr>
+            <w:tcW w:type="dxa" w:w="3784"/>
+            <w:shd w:fill="1A1A2E" w:val="clear"/>
+          </w:tcPr>
+          <w:p>
+            <w:pPr>
+              <w:jc w:val="center"/>
+            </w:pPr>
+            <w:r>
+              <w:rPr>
+                <w:b/>
+                <w:color w:val="FFFFFF"/>
+                <w:sz w:val="18"/>
+              </w:rPr>
+              <w:t>#</w:t>
+            </w:r>
+          </w:p>
+        </w:tc>
+        <w:tc>
+          <w:tcPr>
+            <w:tcW w:type="dxa" w:w="3784"/>
+            <w:shd w:fill="1A1A2E" w:val="clear"/>
+          </w:tcPr>
+          <w:p>
+            <w:pPr>
+              <w:jc w:val="center"/>
+            </w:pPr>
+            <w:r>
+              <w:rPr>
+                <w:b/>
+                <w:color w:val="FFFFFF"/>
+                <w:sz w:val="18"/>
+              </w:rPr>
+              <w:t>Test Item</w:t>
+            </w:r>
+          </w:p>
+        </w:tc>
+        <w:tc>
+          <w:tcPr>
+            <w:tcW w:type="dxa" w:w="3784"/>
+            <w:shd w:fill="1A1A2E" w:val="clear"/>
+          </w:tcPr>
+          <w:p>
+            <w:pPr>
+              <w:jc w:val="center"/>
+            </w:pPr>
+            <w:r>
+              <w:rPr>
+                <w:b/>
+                <w:color w:val="FFFFFF"/>
+                <w:sz w:val="18"/>
+              </w:rPr>
+              <w:t>Status</w:t>
+            </w:r>
+          </w:p>
+        </w:tc>
+        <w:tc>
+          <w:tcPr>
+            <w:tcW w:type="dxa" w:w="3784"/>
+            <w:shd w:fill="1A1A2E" w:val="clear"/>
+          </w:tcPr>
+          <w:p>
+            <w:pPr>
+              <w:jc w:val="center"/>
+            </w:pPr>
+            <w:r>
+              <w:rPr>
+                <w:b/>
+                <w:color w:val="FFFFFF"/>
+                <w:sz w:val="18"/>
+              </w:rPr>
+              <w:t>Comments</w:t>
+            </w:r>
+          </w:p>
+        </w:tc>
+      </w:tr>
+      <w:tr>
+        <w:tc>
+          <w:tcPr>
+            <w:tcW w:type="dxa" w:w="454"/>
+          </w:tcPr>
+          <w:p>
+            <w:pPr>
+              <w:jc w:val="center"/>
+            </w:pPr>
+            <w:r>
+              <w:rPr>
+                <w:sz w:val="18"/>
+              </w:rPr>
+              <w:t>1</w:t>
+            </w:r>
+          </w:p>
+        </w:tc>
+        <w:tc>
+          <w:tcPr>
+            <w:tcW w:type="dxa" w:w="9071"/>
+          </w:tcPr>
+          <w:p>
+            <w:r>
+              <w:rPr>
+                <w:sz w:val="18"/>
+              </w:rPr>
+              <w:t>Navigate to /container: Container ID field renders, no persistent numpad</w:t>
+            </w:r>
+          </w:p>
+        </w:tc>
+        <w:tc>
+          <w:tcPr>
+            <w:tcW w:type="dxa" w:w="1417"/>
+          </w:tcPr>
+          <w:p>
+            <w:pPr>
+              <w:jc w:val="center"/>
+            </w:pPr>
+          </w:p>
+        </w:tc>
+        <w:tc>
+          <w:tcPr>
+            <w:tcW w:type="dxa" w:w="3402"/>
+          </w:tcPr>
+          <w:p/>
+        </w:tc>
+      </w:tr>
+      <w:tr>
+        <w:tc>
+          <w:tcPr>
+            <w:tcW w:type="dxa" w:w="454"/>
+            <w:shd w:fill="F0F0F5" w:val="clear"/>
+          </w:tcPr>
+          <w:p>
+            <w:pPr>
+              <w:jc w:val="center"/>
+            </w:pPr>
+            <w:r>
+              <w:rPr>
+                <w:sz w:val="18"/>
+              </w:rPr>
+              <w:t>2</w:t>
+            </w:r>
+          </w:p>
+        </w:tc>
+        <w:tc>
+          <w:tcPr>
+            <w:tcW w:type="dxa" w:w="9071"/>
+            <w:shd w:fill="F0F0F5" w:val="clear"/>
+          </w:tcPr>
+          <w:p>
+            <w:r>
+              <w:rPr>
+                <w:sz w:val="18"/>
+              </w:rPr>
+              <w:t>Numpad opens on field focus, dismisses on blur/lookup</w:t>
+            </w:r>
+          </w:p>
+        </w:tc>
+        <w:tc>
+          <w:tcPr>
+            <w:tcW w:type="dxa" w:w="1417"/>
+            <w:shd w:fill="F0F0F5" w:val="clear"/>
+          </w:tcPr>
+          <w:p>
+            <w:pPr>
+              <w:jc w:val="center"/>
+            </w:pPr>
+          </w:p>
+        </w:tc>
+        <w:tc>
+          <w:tcPr>
+            <w:tcW w:type="dxa" w:w="3402"/>
+            <w:shd w:fill="F0F0F5" w:val="clear"/>
+          </w:tcPr>
+          <w:p/>
+        </w:tc>
+      </w:tr>
+      <w:tr>
+        <w:tc>
+          <w:tcPr>
+            <w:tcW w:type="dxa" w:w="454"/>
+          </w:tcPr>
+          <w:p>
+            <w:pPr>
+              <w:jc w:val="center"/>
+            </w:pPr>
+            <w:r>
+              <w:rPr>
+                <w:sz w:val="18"/>
+              </w:rPr>
+              <w:t>3</w:t>
+            </w:r>
+          </w:p>
+        </w:tc>
+        <w:tc>
+          <w:tcPr>
+            <w:tcW w:type="dxa" w:w="9071"/>
+          </w:tcPr>
+          <w:p>
+            <w:r>
+              <w:rPr>
+                <w:sz w:val="18"/>
+              </w:rPr>
+              <w:t>Valid Full Case (91) CID: detail loads with pull info, quantities, pallet link</w:t>
+            </w:r>
+          </w:p>
+        </w:tc>
+        <w:tc>
+          <w:tcPr>
+            <w:tcW w:type="dxa" w:w="1417"/>
+          </w:tcPr>
+          <w:p>
+            <w:pPr>
+              <w:jc w:val="center"/>
+            </w:pPr>
+          </w:p>
+        </w:tc>
+        <w:tc>
+          <w:tcPr>
+            <w:tcW w:type="dxa" w:w="3402"/>
+          </w:tcPr>
+          <w:p/>
+        </w:tc>
+      </w:tr>
+      <w:tr>
+        <w:tc>
+          <w:tcPr>
+            <w:tcW w:type="dxa" w:w="454"/>
+            <w:shd w:fill="F0F0F5" w:val="clear"/>
+          </w:tcPr>
+          <w:p>
+            <w:pPr>
+              <w:jc w:val="center"/>
+            </w:pPr>
+            <w:r>
+              <w:rPr>
+                <w:sz w:val="18"/>
+              </w:rPr>
+              <w:t>4</w:t>
+            </w:r>
+          </w:p>
+        </w:tc>
+        <w:tc>
+          <w:tcPr>
+            <w:tcW w:type="dxa" w:w="9071"/>
+            <w:shd w:fill="F0F0F5" w:val="clear"/>
+          </w:tcPr>
+          <w:p>
+            <w:r>
+              <w:rPr>
+                <w:sz w:val="18"/>
+              </w:rPr>
+              <w:t>Valid Overpack (92) CID: detail loads with open/closed state, contents list</w:t>
+            </w:r>
+          </w:p>
+        </w:tc>
+        <w:tc>
+          <w:tcPr>
+            <w:tcW w:type="dxa" w:w="1417"/>
+            <w:shd w:fill="F0F0F5" w:val="clear"/>
+          </w:tcPr>
+          <w:p>
+            <w:pPr>
+              <w:jc w:val="center"/>
+            </w:pPr>
+          </w:p>
+        </w:tc>
+        <w:tc>
+          <w:tcPr>
+            <w:tcW w:type="dxa" w:w="3402"/>
+            <w:shd w:fill="F0F0F5" w:val="clear"/>
+          </w:tcPr>
+          <w:p/>
+        </w:tc>
+      </w:tr>
+      <w:tr>
+        <w:tc>
+          <w:tcPr>
+            <w:tcW w:type="dxa" w:w="454"/>
+          </w:tcPr>
+          <w:p>
+            <w:pPr>
+              <w:jc w:val="center"/>
+            </w:pPr>
+            <w:r>
+              <w:rPr>
+                <w:sz w:val="18"/>
+              </w:rPr>
+              <w:t>5</w:t>
+            </w:r>
+          </w:p>
+        </w:tc>
+        <w:tc>
+          <w:tcPr>
+            <w:tcW w:type="dxa" w:w="9071"/>
+          </w:tcPr>
+          <w:p>
+            <w:r>
+              <w:rPr>
+                <w:sz w:val="18"/>
+              </w:rPr>
+              <w:t>Valid SSP Pull Master (93) CID: detail loads with children list, cascade cancel info</w:t>
+            </w:r>
+          </w:p>
+        </w:tc>
+        <w:tc>
+          <w:tcPr>
+            <w:tcW w:type="dxa" w:w="1417"/>
+          </w:tcPr>
+          <w:p>
+            <w:pPr>
+              <w:jc w:val="center"/>
+            </w:pPr>
+          </w:p>
+        </w:tc>
+        <w:tc>
+          <w:tcPr>
+            <w:tcW w:type="dxa" w:w="3402"/>
+          </w:tcPr>
+          <w:p/>
+        </w:tc>
+      </w:tr>
+      <w:tr>
+        <w:tc>
+          <w:tcPr>
+            <w:tcW w:type="dxa" w:w="454"/>
+            <w:shd w:fill="F0F0F5" w:val="clear"/>
+          </w:tcPr>
+          <w:p>
+            <w:pPr>
+              <w:jc w:val="center"/>
+            </w:pPr>
+            <w:r>
+              <w:rPr>
+                <w:sz w:val="18"/>
+              </w:rPr>
+              <w:t>6</w:t>
+            </w:r>
+          </w:p>
+        </w:tc>
+        <w:tc>
+          <w:tcPr>
+            <w:tcW w:type="dxa" w:w="9071"/>
+            <w:shd w:fill="F0F0F5" w:val="clear"/>
+          </w:tcPr>
+          <w:p>
+            <w:r>
+              <w:rPr>
+                <w:sz w:val="18"/>
+              </w:rPr>
+              <w:t>Valid SSP Unit (94) CID: read-only detail with source master link</w:t>
+            </w:r>
+          </w:p>
+        </w:tc>
+        <w:tc>
+          <w:tcPr>
+            <w:tcW w:type="dxa" w:w="1417"/>
+            <w:shd w:fill="F0F0F5" w:val="clear"/>
+          </w:tcPr>
+          <w:p>
+            <w:pPr>
+              <w:jc w:val="center"/>
+            </w:pPr>
+          </w:p>
+        </w:tc>
+        <w:tc>
+          <w:tcPr>
+            <w:tcW w:type="dxa" w:w="3402"/>
+            <w:shd w:fill="F0F0F5" w:val="clear"/>
+          </w:tcPr>
+          <w:p/>
+        </w:tc>
+      </w:tr>
+      <w:tr>
+        <w:tc>
+          <w:tcPr>
+            <w:tcW w:type="dxa" w:w="454"/>
+          </w:tcPr>
+          <w:p>
+            <w:pPr>
+              <w:jc w:val="center"/>
+            </w:pPr>
+            <w:r>
+              <w:rPr>
+                <w:sz w:val="18"/>
+              </w:rPr>
+              <w:t>7</w:t>
+            </w:r>
+          </w:p>
+        </w:tc>
+        <w:tc>
+          <w:tcPr>
+            <w:tcW w:type="dxa" w:w="9071"/>
+          </w:tcPr>
+          <w:p>
+            <w:r>
+              <w:rPr>
+                <w:sz w:val="18"/>
+              </w:rPr>
+              <w:t>Valid Stray Each (95) CID: detail loads with destination, found-by info</w:t>
+            </w:r>
+          </w:p>
+        </w:tc>
+        <w:tc>
+          <w:tcPr>
+            <w:tcW w:type="dxa" w:w="1417"/>
+          </w:tcPr>
+          <w:p>
+            <w:pPr>
+              <w:jc w:val="center"/>
+            </w:pPr>
+          </w:p>
+        </w:tc>
+        <w:tc>
+          <w:tcPr>
+            <w:tcW w:type="dxa" w:w="3402"/>
+          </w:tcPr>
+          <w:p/>
+        </w:tc>
+      </w:tr>
+      <w:tr>
+        <w:tc>
+          <w:tcPr>
+            <w:tcW w:type="dxa" w:w="454"/>
+            <w:shd w:fill="F0F0F5" w:val="clear"/>
+          </w:tcPr>
+          <w:p>
+            <w:pPr>
+              <w:jc w:val="center"/>
+            </w:pPr>
+            <w:r>
+              <w:rPr>
+                <w:sz w:val="18"/>
+              </w:rPr>
+              <w:t>8</w:t>
+            </w:r>
+          </w:p>
+        </w:tc>
+        <w:tc>
+          <w:tcPr>
+            <w:tcW w:type="dxa" w:w="9071"/>
+            <w:shd w:fill="F0F0F5" w:val="clear"/>
+          </w:tcPr>
+          <w:p>
+            <w:r>
+              <w:rPr>
+                <w:sz w:val="18"/>
+              </w:rPr>
+              <w:t>Compressed CID input expanded correctly to canonical 35-digit form</w:t>
+            </w:r>
+          </w:p>
+        </w:tc>
+        <w:tc>
+          <w:tcPr>
+            <w:tcW w:type="dxa" w:w="1417"/>
+            <w:shd w:fill="F0F0F5" w:val="clear"/>
+          </w:tcPr>
+          <w:p>
+            <w:pPr>
+              <w:jc w:val="center"/>
+            </w:pPr>
+          </w:p>
+        </w:tc>
+        <w:tc>
+          <w:tcPr>
+            <w:tcW w:type="dxa" w:w="3402"/>
+            <w:shd w:fill="F0F0F5" w:val="clear"/>
+          </w:tcPr>
+          <w:p/>
+        </w:tc>
+      </w:tr>
+      <w:tr>
+        <w:tc>
+          <w:tcPr>
+            <w:tcW w:type="dxa" w:w="454"/>
+          </w:tcPr>
+          <w:p>
+            <w:pPr>
+              <w:jc w:val="center"/>
+            </w:pPr>
+            <w:r>
+              <w:rPr>
+                <w:sz w:val="18"/>
+              </w:rPr>
+              <w:t>9</w:t>
+            </w:r>
+          </w:p>
+        </w:tc>
+        <w:tc>
+          <w:tcPr>
+            <w:tcW w:type="dxa" w:w="9071"/>
+          </w:tcPr>
+          <w:p>
+            <w:r>
+              <w:rPr>
+                <w:sz w:val="18"/>
+              </w:rPr>
+              <w:t>Nonexistent CID: error tone, 'Container not found', red wash on field</w:t>
+            </w:r>
+          </w:p>
+        </w:tc>
+        <w:tc>
+          <w:tcPr>
+            <w:tcW w:type="dxa" w:w="1417"/>
+          </w:tcPr>
+          <w:p>
+            <w:pPr>
+              <w:jc w:val="center"/>
+            </w:pPr>
+          </w:p>
+        </w:tc>
+        <w:tc>
+          <w:tcPr>
+            <w:tcW w:type="dxa" w:w="3402"/>
+          </w:tcPr>
+          <w:p/>
+        </w:tc>
+      </w:tr>
+      <w:tr>
+        <w:tc>
+          <w:tcPr>
+            <w:tcW w:type="dxa" w:w="454"/>
+            <w:shd w:fill="F0F0F5" w:val="clear"/>
+          </w:tcPr>
+          <w:p>
+            <w:pPr>
+              <w:jc w:val="center"/>
+            </w:pPr>
+            <w:r>
+              <w:rPr>
+                <w:sz w:val="18"/>
+              </w:rPr>
+              <w:t>10</w:t>
+            </w:r>
+          </w:p>
+        </w:tc>
+        <w:tc>
+          <w:tcPr>
+            <w:tcW w:type="dxa" w:w="9071"/>
+            <w:shd w:fill="F0F0F5" w:val="clear"/>
+          </w:tcPr>
+          <w:p>
+            <w:r>
+              <w:rPr>
+                <w:sz w:val="18"/>
+              </w:rPr>
+              <w:t>Type label and status badge render in header next to CID field</w:t>
+            </w:r>
+          </w:p>
+        </w:tc>
+        <w:tc>
+          <w:tcPr>
+            <w:tcW w:type="dxa" w:w="1417"/>
+            <w:shd w:fill="F0F0F5" w:val="clear"/>
+          </w:tcPr>
+          <w:p>
+            <w:pPr>
+              <w:jc w:val="center"/>
+            </w:pPr>
+          </w:p>
+        </w:tc>
+        <w:tc>
+          <w:tcPr>
+            <w:tcW w:type="dxa" w:w="3402"/>
+            <w:shd w:fill="F0F0F5" w:val="clear"/>
+          </w:tcPr>
+          <w:p/>
+        </w:tc>
+      </w:tr>
+      <w:tr>
+        <w:tc>
+          <w:tcPr>
+            <w:tcW w:type="dxa" w:w="454"/>
+          </w:tcPr>
+          <w:p>
+            <w:pPr>
+              <w:jc w:val="center"/>
+            </w:pPr>
+            <w:r>
+              <w:rPr>
+                <w:sz w:val="18"/>
+              </w:rPr>
+              <w:t>11</w:t>
+            </w:r>
+          </w:p>
+        </w:tc>
+        <w:tc>
+          <w:tcPr>
+            <w:tcW w:type="dxa" w:w="9071"/>
+          </w:tcPr>
+          <w:p>
+            <w:r>
+              <w:rPr>
+                <w:sz w:val="18"/>
+              </w:rPr>
+              <w:t>Event log (right column) populates with timestamped entries</w:t>
+            </w:r>
+          </w:p>
+        </w:tc>
+        <w:tc>
+          <w:tcPr>
+            <w:tcW w:type="dxa" w:w="1417"/>
+          </w:tcPr>
+          <w:p>
+            <w:pPr>
+              <w:jc w:val="center"/>
+            </w:pPr>
+          </w:p>
+        </w:tc>
+        <w:tc>
+          <w:tcPr>
+            <w:tcW w:type="dxa" w:w="3402"/>
+          </w:tcPr>
+          <w:p/>
+        </w:tc>
+      </w:tr>
+      <w:tr>
+        <w:tc>
+          <w:tcPr>
+            <w:tcW w:type="dxa" w:w="454"/>
+            <w:shd w:fill="F0F0F5" w:val="clear"/>
+          </w:tcPr>
+          <w:p>
+            <w:pPr>
+              <w:jc w:val="center"/>
+            </w:pPr>
+            <w:r>
+              <w:rPr>
+                <w:sz w:val="18"/>
+              </w:rPr>
+              <w:t>12</w:t>
+            </w:r>
+          </w:p>
+        </w:tc>
+        <w:tc>
+          <w:tcPr>
+            <w:tcW w:type="dxa" w:w="9071"/>
+            <w:shd w:fill="F0F0F5" w:val="clear"/>
+          </w:tcPr>
+          <w:p>
+            <w:r>
+              <w:rPr>
+                <w:sz w:val="18"/>
+              </w:rPr>
+              <w:t>Event log shows reason codes, user names, child CID links, store/qty changes</w:t>
+            </w:r>
+          </w:p>
+        </w:tc>
+        <w:tc>
+          <w:tcPr>
+            <w:tcW w:type="dxa" w:w="1417"/>
+            <w:shd w:fill="F0F0F5" w:val="clear"/>
+          </w:tcPr>
+          <w:p>
+            <w:pPr>
+              <w:jc w:val="center"/>
+            </w:pPr>
+          </w:p>
+        </w:tc>
+        <w:tc>
+          <w:tcPr>
+            <w:tcW w:type="dxa" w:w="3402"/>
+            <w:shd w:fill="F0F0F5" w:val="clear"/>
+          </w:tcPr>
+          <w:p/>
+        </w:tc>
+      </w:tr>
+      <w:tr>
+        <w:tc>
+          <w:tcPr>
+            <w:tcW w:type="dxa" w:w="454"/>
+          </w:tcPr>
+          <w:p>
+            <w:pPr>
+              <w:jc w:val="center"/>
+            </w:pPr>
+            <w:r>
+              <w:rPr>
+                <w:sz w:val="18"/>
+              </w:rPr>
+              <w:t>13</w:t>
+            </w:r>
+          </w:p>
+        </w:tc>
+        <w:tc>
+          <w:tcPr>
+            <w:tcW w:type="dxa" w:w="9071"/>
+          </w:tcPr>
+          <w:p>
+            <w:r>
+              <w:rPr>
+                <w:sz w:val="18"/>
+              </w:rPr>
+              <w:t>Tap DPCI link: navigates to IID with dpci param</w:t>
+            </w:r>
+          </w:p>
+        </w:tc>
+        <w:tc>
+          <w:tcPr>
+            <w:tcW w:type="dxa" w:w="1417"/>
+          </w:tcPr>
+          <w:p>
+            <w:pPr>
+              <w:jc w:val="center"/>
+            </w:pPr>
+          </w:p>
+        </w:tc>
+        <w:tc>
+          <w:tcPr>
+            <w:tcW w:type="dxa" w:w="3402"/>
+          </w:tcPr>
+          <w:p/>
+        </w:tc>
+      </w:tr>
+      <w:tr>
+        <w:tc>
+          <w:tcPr>
+            <w:tcW w:type="dxa" w:w="454"/>
+            <w:shd w:fill="F0F0F5" w:val="clear"/>
+          </w:tcPr>
+          <w:p>
+            <w:pPr>
+              <w:jc w:val="center"/>
+            </w:pPr>
+            <w:r>
+              <w:rPr>
+                <w:sz w:val="18"/>
+              </w:rPr>
+              <w:t>14</w:t>
+            </w:r>
+          </w:p>
+        </w:tc>
+        <w:tc>
+          <w:tcPr>
+            <w:tcW w:type="dxa" w:w="9071"/>
+            <w:shd w:fill="F0F0F5" w:val="clear"/>
+          </w:tcPr>
+          <w:p>
+            <w:r>
+              <w:rPr>
+                <w:sz w:val="18"/>
+              </w:rPr>
+              <w:t>Tap Pallet ID link: navigates to PII with pid param</w:t>
+            </w:r>
+          </w:p>
+        </w:tc>
+        <w:tc>
+          <w:tcPr>
+            <w:tcW w:type="dxa" w:w="1417"/>
+            <w:shd w:fill="F0F0F5" w:val="clear"/>
+          </w:tcPr>
+          <w:p>
+            <w:pPr>
+              <w:jc w:val="center"/>
+            </w:pPr>
+          </w:p>
+        </w:tc>
+        <w:tc>
+          <w:tcPr>
+            <w:tcW w:type="dxa" w:w="3402"/>
+            <w:shd w:fill="F0F0F5" w:val="clear"/>
+          </w:tcPr>
+          <w:p/>
+        </w:tc>
+      </w:tr>
+      <w:tr>
+        <w:tc>
+          <w:tcPr>
+            <w:tcW w:type="dxa" w:w="454"/>
+          </w:tcPr>
+          <w:p>
+            <w:pPr>
+              <w:jc w:val="center"/>
+            </w:pPr>
+            <w:r>
+              <w:rPr>
+                <w:sz w:val="18"/>
+              </w:rPr>
+              <w:t>15</w:t>
+            </w:r>
+          </w:p>
+        </w:tc>
+        <w:tc>
+          <w:tcPr>
+            <w:tcW w:type="dxa" w:w="9071"/>
+          </w:tcPr>
+          <w:p>
+            <w:r>
+              <w:rPr>
+                <w:sz w:val="18"/>
+              </w:rPr>
+              <w:t>Tap Location link: navigates to LII with loc param</w:t>
+            </w:r>
+          </w:p>
+        </w:tc>
+        <w:tc>
+          <w:tcPr>
+            <w:tcW w:type="dxa" w:w="1417"/>
+          </w:tcPr>
+          <w:p>
+            <w:pPr>
+              <w:jc w:val="center"/>
+            </w:pPr>
+          </w:p>
+        </w:tc>
+        <w:tc>
+          <w:tcPr>
+            <w:tcW w:type="dxa" w:w="3402"/>
+          </w:tcPr>
+          <w:p/>
+        </w:tc>
+      </w:tr>
+      <w:tr>
+        <w:tc>
+          <w:tcPr>
+            <w:tcW w:type="dxa" w:w="454"/>
+            <w:shd w:fill="F0F0F5" w:val="clear"/>
+          </w:tcPr>
+          <w:p>
+            <w:pPr>
+              <w:jc w:val="center"/>
+            </w:pPr>
+            <w:r>
+              <w:rPr>
+                <w:sz w:val="18"/>
+              </w:rPr>
+              <w:t>16</w:t>
+            </w:r>
+          </w:p>
+        </w:tc>
+        <w:tc>
+          <w:tcPr>
+            <w:tcW w:type="dxa" w:w="9071"/>
+            <w:shd w:fill="F0F0F5" w:val="clear"/>
+          </w:tcPr>
+          <w:p>
+            <w:r>
+              <w:rPr>
+                <w:sz w:val="18"/>
+              </w:rPr>
+              <w:t>Tap child/source CID link: reloads CII with that CID</w:t>
+            </w:r>
+          </w:p>
+        </w:tc>
+        <w:tc>
+          <w:tcPr>
+            <w:tcW w:type="dxa" w:w="1417"/>
+            <w:shd w:fill="F0F0F5" w:val="clear"/>
+          </w:tcPr>
+          <w:p>
+            <w:pPr>
+              <w:jc w:val="center"/>
+            </w:pPr>
+          </w:p>
+        </w:tc>
+        <w:tc>
+          <w:tcPr>
+            <w:tcW w:type="dxa" w:w="3402"/>
+            <w:shd w:fill="F0F0F5" w:val="clear"/>
+          </w:tcPr>
+          <w:p/>
+        </w:tc>
+      </w:tr>
+      <w:tr>
+        <w:tc>
+          <w:tcPr>
+            <w:tcW w:type="dxa" w:w="454"/>
+          </w:tcPr>
+          <w:p>
+            <w:pPr>
+              <w:jc w:val="center"/>
+            </w:pPr>
+            <w:r>
+              <w:rPr>
+                <w:sz w:val="18"/>
+              </w:rPr>
+              <w:t>17</w:t>
+            </w:r>
+          </w:p>
+        </w:tc>
+        <w:tc>
+          <w:tcPr>
+            <w:tcW w:type="dxa" w:w="9071"/>
+          </w:tcPr>
+          <w:p>
+            <w:r>
+              <w:rPr>
+                <w:sz w:val="18"/>
+              </w:rPr>
+              <w:t>Cancel button (Full Case, IM+): visible only for AVAILABLE/VERIFIED status</w:t>
+            </w:r>
+          </w:p>
+        </w:tc>
+        <w:tc>
+          <w:tcPr>
+            <w:tcW w:type="dxa" w:w="1417"/>
+          </w:tcPr>
+          <w:p>
+            <w:pPr>
+              <w:jc w:val="center"/>
+            </w:pPr>
+          </w:p>
+        </w:tc>
+        <w:tc>
+          <w:tcPr>
+            <w:tcW w:type="dxa" w:w="3402"/>
+          </w:tcPr>
+          <w:p/>
+        </w:tc>
+      </w:tr>
+      <w:tr>
+        <w:tc>
+          <w:tcPr>
+            <w:tcW w:type="dxa" w:w="454"/>
+            <w:shd w:fill="F0F0F5" w:val="clear"/>
+          </w:tcPr>
+          <w:p>
+            <w:pPr>
+              <w:jc w:val="center"/>
+            </w:pPr>
+            <w:r>
+              <w:rPr>
+                <w:sz w:val="18"/>
+              </w:rPr>
+              <w:t>18</w:t>
+            </w:r>
+          </w:p>
+        </w:tc>
+        <w:tc>
+          <w:tcPr>
+            <w:tcW w:type="dxa" w:w="9071"/>
+            <w:shd w:fill="F0F0F5" w:val="clear"/>
+          </w:tcPr>
+          <w:p>
+            <w:r>
+              <w:rPr>
+                <w:sz w:val="18"/>
+              </w:rPr>
+              <w:t>Cancel modal: ReasonCodeField (CONTAINER_CANCEL domain), optional note, confirm flow</w:t>
+            </w:r>
+          </w:p>
+        </w:tc>
+        <w:tc>
+          <w:tcPr>
+            <w:tcW w:type="dxa" w:w="1417"/>
+            <w:shd w:fill="F0F0F5" w:val="clear"/>
+          </w:tcPr>
+          <w:p>
+            <w:pPr>
+              <w:jc w:val="center"/>
+            </w:pPr>
+          </w:p>
+        </w:tc>
+        <w:tc>
+          <w:tcPr>
+            <w:tcW w:type="dxa" w:w="3402"/>
+            <w:shd w:fill="F0F0F5" w:val="clear"/>
+          </w:tcPr>
+          <w:p/>
+        </w:tc>
+      </w:tr>
+      <w:tr>
+        <w:tc>
+          <w:tcPr>
+            <w:tcW w:type="dxa" w:w="454"/>
+          </w:tcPr>
+          <w:p>
+            <w:pPr>
+              <w:jc w:val="center"/>
+            </w:pPr>
+            <w:r>
+              <w:rPr>
+                <w:sz w:val="18"/>
+              </w:rPr>
+              <w:t>19</w:t>
+            </w:r>
+          </w:p>
+        </w:tc>
+        <w:tc>
+          <w:tcPr>
+            <w:tcW w:type="dxa" w:w="9071"/>
+          </w:tcPr>
+          <w:p>
+            <w:r>
+              <w:rPr>
+                <w:sz w:val="18"/>
+              </w:rPr>
+              <w:t>Cancel SSP Master (IM+): cascade warning with PENDING child count</w:t>
+            </w:r>
+          </w:p>
+        </w:tc>
+        <w:tc>
+          <w:tcPr>
+            <w:tcW w:type="dxa" w:w="1417"/>
+          </w:tcPr>
+          <w:p>
+            <w:pPr>
+              <w:jc w:val="center"/>
+            </w:pPr>
+          </w:p>
+        </w:tc>
+        <w:tc>
+          <w:tcPr>
+            <w:tcW w:type="dxa" w:w="3402"/>
+          </w:tcPr>
+          <w:p/>
+        </w:tc>
+      </w:tr>
+      <w:tr>
+        <w:tc>
+          <w:tcPr>
+            <w:tcW w:type="dxa" w:w="454"/>
+            <w:shd w:fill="F0F0F5" w:val="clear"/>
+          </w:tcPr>
+          <w:p>
+            <w:pPr>
+              <w:jc w:val="center"/>
+            </w:pPr>
+            <w:r>
+              <w:rPr>
+                <w:sz w:val="18"/>
+              </w:rPr>
+              <w:t>20</w:t>
+            </w:r>
+          </w:p>
+        </w:tc>
+        <w:tc>
+          <w:tcPr>
+            <w:tcW w:type="dxa" w:w="9071"/>
+            <w:shd w:fill="F0F0F5" w:val="clear"/>
+          </w:tcPr>
+          <w:p>
+            <w:r>
+              <w:rPr>
+                <w:sz w:val="18"/>
+              </w:rPr>
+              <w:t>Force Close overpack (IM+): visible when open and not purged</w:t>
+            </w:r>
+          </w:p>
+        </w:tc>
+        <w:tc>
+          <w:tcPr>
+            <w:tcW w:type="dxa" w:w="1417"/>
+            <w:shd w:fill="F0F0F5" w:val="clear"/>
+          </w:tcPr>
+          <w:p>
+            <w:pPr>
+              <w:jc w:val="center"/>
+            </w:pPr>
+          </w:p>
+        </w:tc>
+        <w:tc>
+          <w:tcPr>
+            <w:tcW w:type="dxa" w:w="3402"/>
+            <w:shd w:fill="F0F0F5" w:val="clear"/>
+          </w:tcPr>
+          <w:p/>
+        </w:tc>
+      </w:tr>
+      <w:tr>
+        <w:tc>
+          <w:tcPr>
+            <w:tcW w:type="dxa" w:w="454"/>
+          </w:tcPr>
+          <w:p>
+            <w:pPr>
+              <w:jc w:val="center"/>
+            </w:pPr>
+            <w:r>
+              <w:rPr>
+                <w:sz w:val="18"/>
+              </w:rPr>
+              <w:t>21</w:t>
+            </w:r>
+          </w:p>
+        </w:tc>
+        <w:tc>
+          <w:tcPr>
+            <w:tcW w:type="dxa" w:w="9071"/>
+          </w:tcPr>
+          <w:p>
+            <w:r>
+              <w:rPr>
+                <w:sz w:val="18"/>
+              </w:rPr>
+              <w:t>Reopen overpack (IM+): visible when closed and not purged</w:t>
+            </w:r>
+          </w:p>
+        </w:tc>
+        <w:tc>
+          <w:tcPr>
+            <w:tcW w:type="dxa" w:w="1417"/>
+          </w:tcPr>
+          <w:p>
+            <w:pPr>
+              <w:jc w:val="center"/>
+            </w:pPr>
+          </w:p>
+        </w:tc>
+        <w:tc>
+          <w:tcPr>
+            <w:tcW w:type="dxa" w:w="3402"/>
+          </w:tcPr>
+          <w:p/>
+        </w:tc>
+      </w:tr>
+      <w:tr>
+        <w:tc>
+          <w:tcPr>
+            <w:tcW w:type="dxa" w:w="454"/>
+            <w:shd w:fill="F0F0F5" w:val="clear"/>
+          </w:tcPr>
+          <w:p>
+            <w:pPr>
+              <w:jc w:val="center"/>
+            </w:pPr>
+            <w:r>
+              <w:rPr>
+                <w:sz w:val="18"/>
+              </w:rPr>
+              <w:t>22</w:t>
+            </w:r>
+          </w:p>
+        </w:tc>
+        <w:tc>
+          <w:tcPr>
+            <w:tcW w:type="dxa" w:w="9071"/>
+            <w:shd w:fill="F0F0F5" w:val="clear"/>
+          </w:tcPr>
+          <w:p>
+            <w:r>
+              <w:rPr>
+                <w:sz w:val="18"/>
+              </w:rPr>
+              <w:t>Overpack action modal: ReasonCodeField (OVERPACK_STATUS domain), confirm flow</w:t>
+            </w:r>
+          </w:p>
+        </w:tc>
+        <w:tc>
+          <w:tcPr>
+            <w:tcW w:type="dxa" w:w="1417"/>
+            <w:shd w:fill="F0F0F5" w:val="clear"/>
+          </w:tcPr>
+          <w:p>
+            <w:pPr>
+              <w:jc w:val="center"/>
+            </w:pPr>
+          </w:p>
+        </w:tc>
+        <w:tc>
+          <w:tcPr>
+            <w:tcW w:type="dxa" w:w="3402"/>
+            <w:shd w:fill="F0F0F5" w:val="clear"/>
+          </w:tcPr>
+          <w:p/>
+        </w:tc>
+      </w:tr>
+      <w:tr>
+        <w:tc>
+          <w:tcPr>
+            <w:tcW w:type="dxa" w:w="454"/>
+          </w:tcPr>
+          <w:p>
+            <w:pPr>
+              <w:jc w:val="center"/>
+            </w:pPr>
+            <w:r>
+              <w:rPr>
+                <w:sz w:val="18"/>
+              </w:rPr>
+              <w:t>23</w:t>
+            </w:r>
+          </w:p>
+        </w:tc>
+        <w:tc>
+          <w:tcPr>
+            <w:tcW w:type="dxa" w:w="9071"/>
+          </w:tcPr>
+          <w:p>
+            <w:r>
+              <w:rPr>
+                <w:sz w:val="18"/>
+              </w:rPr>
+              <w:t>Reassign stray each (IM+): visible when status is PENDING</w:t>
+            </w:r>
+          </w:p>
+        </w:tc>
+        <w:tc>
+          <w:tcPr>
+            <w:tcW w:type="dxa" w:w="1417"/>
+          </w:tcPr>
+          <w:p>
+            <w:pPr>
+              <w:jc w:val="center"/>
+            </w:pPr>
+          </w:p>
+        </w:tc>
+        <w:tc>
+          <w:tcPr>
+            <w:tcW w:type="dxa" w:w="3402"/>
+          </w:tcPr>
+          <w:p/>
+        </w:tc>
+      </w:tr>
+      <w:tr>
+        <w:tc>
+          <w:tcPr>
+            <w:tcW w:type="dxa" w:w="454"/>
+            <w:shd w:fill="F0F0F5" w:val="clear"/>
+          </w:tcPr>
+          <w:p>
+            <w:pPr>
+              <w:jc w:val="center"/>
+            </w:pPr>
+            <w:r>
+              <w:rPr>
+                <w:sz w:val="18"/>
+              </w:rPr>
+              <w:t>24</w:t>
+            </w:r>
+          </w:p>
+        </w:tc>
+        <w:tc>
+          <w:tcPr>
+            <w:tcW w:type="dxa" w:w="9071"/>
+            <w:shd w:fill="F0F0F5" w:val="clear"/>
+          </w:tcPr>
+          <w:p>
+            <w:r>
+              <w:rPr>
+                <w:sz w:val="18"/>
+              </w:rPr>
+              <w:t>Reassign modal: store selector excludes current store, STRAY_REASSIGN domain</w:t>
+            </w:r>
+          </w:p>
+        </w:tc>
+        <w:tc>
+          <w:tcPr>
+            <w:tcW w:type="dxa" w:w="1417"/>
+            <w:shd w:fill="F0F0F5" w:val="clear"/>
+          </w:tcPr>
+          <w:p>
+            <w:pPr>
+              <w:jc w:val="center"/>
+            </w:pPr>
+          </w:p>
+        </w:tc>
+        <w:tc>
+          <w:tcPr>
+            <w:tcW w:type="dxa" w:w="3402"/>
+            <w:shd w:fill="F0F0F5" w:val="clear"/>
+          </w:tcPr>
+          <w:p/>
+        </w:tc>
+      </w:tr>
+      <w:tr>
+        <w:tc>
+          <w:tcPr>
+            <w:tcW w:type="dxa" w:w="454"/>
+          </w:tcPr>
+          <w:p>
+            <w:pPr>
+              <w:jc w:val="center"/>
+            </w:pPr>
+            <w:r>
+              <w:rPr>
+                <w:sz w:val="18"/>
+              </w:rPr>
+              <w:t>25</w:t>
+            </w:r>
+          </w:p>
+        </w:tc>
+        <w:tc>
+          <w:tcPr>
+            <w:tcW w:type="dxa" w:w="9071"/>
+          </w:tcPr>
+          <w:p>
+            <w:r>
+              <w:rPr>
+                <w:sz w:val="18"/>
+              </w:rPr>
+              <w:t>All action buttons hidden from Worker role</w:t>
+            </w:r>
+          </w:p>
+        </w:tc>
+        <w:tc>
+          <w:tcPr>
+            <w:tcW w:type="dxa" w:w="1417"/>
+          </w:tcPr>
+          <w:p>
+            <w:pPr>
+              <w:jc w:val="center"/>
+            </w:pPr>
+          </w:p>
+        </w:tc>
+        <w:tc>
+          <w:tcPr>
+            <w:tcW w:type="dxa" w:w="3402"/>
+          </w:tcPr>
+          <w:p/>
+        </w:tc>
+      </w:tr>
+      <w:tr>
+        <w:tc>
+          <w:tcPr>
+            <w:tcW w:type="dxa" w:w="454"/>
+            <w:shd w:fill="F0F0F5" w:val="clear"/>
+          </w:tcPr>
+          <w:p>
+            <w:pPr>
+              <w:jc w:val="center"/>
+            </w:pPr>
+            <w:r>
+              <w:rPr>
+                <w:sz w:val="18"/>
+              </w:rPr>
+              <w:t>26</w:t>
+            </w:r>
+          </w:p>
+        </w:tc>
+        <w:tc>
+          <w:tcPr>
+            <w:tcW w:type="dxa" w:w="9071"/>
+            <w:shd w:fill="F0F0F5" w:val="clear"/>
+          </w:tcPr>
+          <w:p>
+            <w:r>
+              <w:rPr>
+                <w:sz w:val="18"/>
+              </w:rPr>
+              <w:t>Success messages display via MessageBar after actions</w:t>
+            </w:r>
+          </w:p>
+        </w:tc>
+        <w:tc>
+          <w:tcPr>
+            <w:tcW w:type="dxa" w:w="1417"/>
+            <w:shd w:fill="F0F0F5" w:val="clear"/>
+          </w:tcPr>
+          <w:p>
+            <w:pPr>
+              <w:jc w:val="center"/>
+            </w:pPr>
+          </w:p>
+        </w:tc>
+        <w:tc>
+          <w:tcPr>
+            <w:tcW w:type="dxa" w:w="3402"/>
+            <w:shd w:fill="F0F0F5" w:val="clear"/>
+          </w:tcPr>
+          <w:p/>
+        </w:tc>
+      </w:tr>
+      <w:tr>
+        <w:tc>
+          <w:tcPr>
+            <w:tcW w:type="dxa" w:w="454"/>
+          </w:tcPr>
+          <w:p>
+            <w:pPr>
+              <w:jc w:val="center"/>
+            </w:pPr>
+            <w:r>
+              <w:rPr>
+                <w:sz w:val="18"/>
+              </w:rPr>
+              <w:t>27</w:t>
+            </w:r>
+          </w:p>
+        </w:tc>
+        <w:tc>
+          <w:tcPr>
+            <w:tcW w:type="dxa" w:w="9071"/>
+          </w:tcPr>
+          <w:p>
+            <w:r>
+              <w:rPr>
+                <w:sz w:val="18"/>
+              </w:rPr>
+              <w:t>Error messages display via MessageBar on action failure</w:t>
+            </w:r>
+          </w:p>
+        </w:tc>
+        <w:tc>
+          <w:tcPr>
+            <w:tcW w:type="dxa" w:w="1417"/>
+          </w:tcPr>
+          <w:p>
+            <w:pPr>
+              <w:jc w:val="center"/>
+            </w:pPr>
+          </w:p>
+        </w:tc>
+        <w:tc>
+          <w:tcPr>
+            <w:tcW w:type="dxa" w:w="3402"/>
+          </w:tcPr>
+          <w:p/>
+        </w:tc>
+      </w:tr>
+      <w:tr>
+        <w:tc>
+          <w:tcPr>
+            <w:tcW w:type="dxa" w:w="454"/>
+            <w:shd w:fill="F0F0F5" w:val="clear"/>
+          </w:tcPr>
+          <w:p>
+            <w:pPr>
+              <w:jc w:val="center"/>
+            </w:pPr>
+            <w:r>
+              <w:rPr>
+                <w:sz w:val="18"/>
+              </w:rPr>
+              <w:t>28</w:t>
+            </w:r>
+          </w:p>
+        </w:tc>
+        <w:tc>
+          <w:tcPr>
+            <w:tcW w:type="dxa" w:w="9071"/>
+            <w:shd w:fill="F0F0F5" w:val="clear"/>
+          </w:tcPr>
+          <w:p>
+            <w:r>
+              <w:rPr>
+                <w:sz w:val="18"/>
+              </w:rPr>
+              <w:t>Session persistence: navigate away and back, last-loaded container restores</w:t>
+            </w:r>
+          </w:p>
+        </w:tc>
+        <w:tc>
+          <w:tcPr>
+            <w:tcW w:type="dxa" w:w="1417"/>
+            <w:shd w:fill="F0F0F5" w:val="clear"/>
+          </w:tcPr>
+          <w:p>
+            <w:pPr>
+              <w:jc w:val="center"/>
+            </w:pPr>
+          </w:p>
+        </w:tc>
+        <w:tc>
+          <w:tcPr>
+            <w:tcW w:type="dxa" w:w="3402"/>
+            <w:shd w:fill="F0F0F5" w:val="clear"/>
+          </w:tcPr>
+          <w:p/>
+        </w:tc>
+      </w:tr>
+      <w:tr>
+        <w:tc>
+          <w:tcPr>
+            <w:tcW w:type="dxa" w:w="454"/>
+          </w:tcPr>
+          <w:p>
+            <w:pPr>
+              <w:jc w:val="center"/>
+            </w:pPr>
+            <w:r>
+              <w:rPr>
+                <w:sz w:val="18"/>
+              </w:rPr>
+              <w:t>29</w:t>
+            </w:r>
+          </w:p>
+        </w:tc>
+        <w:tc>
+          <w:tcPr>
+            <w:tcW w:type="dxa" w:w="9071"/>
+          </w:tcPr>
+          <w:p>
+            <w:r>
+              <w:rPr>
+                <w:sz w:val="18"/>
+              </w:rPr>
+              <w:t>Demo scanner bar provides sample CIDs for all five container types</w:t>
+            </w:r>
+          </w:p>
+        </w:tc>
+        <w:tc>
+          <w:tcPr>
+            <w:tcW w:type="dxa" w:w="1417"/>
+          </w:tcPr>
+          <w:p>
+            <w:pPr>
+              <w:jc w:val="center"/>
+            </w:pPr>
+          </w:p>
+        </w:tc>
+        <w:tc>
+          <w:tcPr>
+            <w:tcW w:type="dxa" w:w="3402"/>
+          </w:tcPr>
+          <w:p/>
+        </w:tc>
+      </w:tr>
+      <w:tr>
+        <w:tc>
+          <w:tcPr>
+            <w:tcW w:type="dxa" w:w="454"/>
+            <w:shd w:fill="F0F0F5" w:val="clear"/>
+          </w:tcPr>
+          <w:p>
+            <w:pPr>
+              <w:jc w:val="center"/>
+            </w:pPr>
+            <w:r>
+              <w:rPr>
+                <w:sz w:val="18"/>
+              </w:rPr>
+              <w:t>30</w:t>
+            </w:r>
+          </w:p>
+        </w:tc>
+        <w:tc>
+          <w:tcPr>
+            <w:tcW w:type="dxa" w:w="9071"/>
+            <w:shd w:fill="F0F0F5" w:val="clear"/>
+          </w:tcPr>
+          <w:p>
+            <w:r>
+              <w:rPr>
+                <w:sz w:val="18"/>
+              </w:rPr>
+              <w:t>Re-scan/re-type CID while loaded: loads new container without nav-away</w:t>
+            </w:r>
+          </w:p>
+        </w:tc>
+        <w:tc>
+          <w:tcPr>
+            <w:tcW w:type="dxa" w:w="1417"/>
+            <w:shd w:fill="F0F0F5" w:val="clear"/>
+          </w:tcPr>
+          <w:p>
+            <w:pPr>
+              <w:jc w:val="center"/>
+            </w:pPr>
+          </w:p>
+        </w:tc>
+        <w:tc>
+          <w:tcPr>
+            <w:tcW w:type="dxa" w:w="3402"/>
+            <w:shd w:fill="F0F0F5" w:val="clear"/>
           </w:tcPr>
           <w:p/>
         </w:tc>

</xml_diff>

<commit_message>
Ship floor-app v1.8.10 + API v1.2.3: PRQ screen, container quantity split, route registration fix (#135)
Co-Authored-By: Claude Opus 4.6 <noreply@anthropic.com>
</commit_message>
<xml_diff>
--- a/Documentation/PalletIQ-Manual-E2E-Checklist.docx
+++ b/Documentation/PalletIQ-Manual-E2E-Checklist.docx
@@ -2392,7 +2392,7 @@
               <w:rPr>
                 <w:sz w:val="18"/>
               </w:rPr>
-              <w:t>Unbuilt function buttons (OCC, PRQ, LRP, WTP) show info message, no nav</w:t>
+              <w:t>PRQ button navigates to /reporting/pull-request</w:t>
             </w:r>
           </w:p>
         </w:tc>
@@ -2441,6 +2441,55 @@
               <w:rPr>
                 <w:sz w:val="18"/>
               </w:rPr>
+              <w:t>Unbuilt function buttons (OCC, LRP, WTP) show info message, no nav</w:t>
+            </w:r>
+          </w:p>
+        </w:tc>
+        <w:tc>
+          <w:tcPr>
+            <w:tcW w:type="dxa" w:w="1417"/>
+          </w:tcPr>
+          <w:p>
+            <w:pPr>
+              <w:jc w:val="center"/>
+            </w:pPr>
+          </w:p>
+        </w:tc>
+        <w:tc>
+          <w:tcPr>
+            <w:tcW w:type="dxa" w:w="3402"/>
+          </w:tcPr>
+          <w:p/>
+        </w:tc>
+      </w:tr>
+      <w:tr>
+        <w:tc>
+          <w:tcPr>
+            <w:tcW w:type="dxa" w:w="454"/>
+            <w:shd w:fill="F0F0F5" w:val="clear"/>
+          </w:tcPr>
+          <w:p>
+            <w:pPr>
+              <w:jc w:val="center"/>
+            </w:pPr>
+            <w:r>
+              <w:rPr>
+                <w:sz w:val="18"/>
+              </w:rPr>
+              <w:t>20</w:t>
+            </w:r>
+          </w:p>
+        </w:tc>
+        <w:tc>
+          <w:tcPr>
+            <w:tcW w:type="dxa" w:w="9071"/>
+            <w:shd w:fill="F0F0F5" w:val="clear"/>
+          </w:tcPr>
+          <w:p>
+            <w:r>
+              <w:rPr>
+                <w:sz w:val="18"/>
+              </w:rPr>
               <w:t>Every button shows jump code badge and function name</w:t>
             </w:r>
           </w:p>
@@ -2448,6 +2497,7 @@
         <w:tc>
           <w:tcPr>
             <w:tcW w:type="dxa" w:w="1417"/>
+            <w:shd w:fill="F0F0F5" w:val="clear"/>
           </w:tcPr>
           <w:p>
             <w:pPr>
@@ -2458,6 +2508,7 @@
         <w:tc>
           <w:tcPr>
             <w:tcW w:type="dxa" w:w="3402"/>
+            <w:shd w:fill="F0F0F5" w:val="clear"/>
           </w:tcPr>
           <w:p/>
         </w:tc>
@@ -15189,6 +15240,1640 @@
                 <w:sz w:val="18"/>
               </w:rPr>
               <w:t>API failure: 'Unable to load today\'s data' fallback</w:t>
+            </w:r>
+          </w:p>
+        </w:tc>
+        <w:tc>
+          <w:tcPr>
+            <w:tcW w:type="dxa" w:w="1417"/>
+          </w:tcPr>
+          <w:p>
+            <w:pPr>
+              <w:jc w:val="center"/>
+            </w:pPr>
+          </w:p>
+        </w:tc>
+        <w:tc>
+          <w:tcPr>
+            <w:tcW w:type="dxa" w:w="3402"/>
+          </w:tcPr>
+          <w:p/>
+        </w:tc>
+      </w:tr>
+    </w:tbl>
+    <w:p>
+      <w:r>
+        <w:br w:type="page"/>
+      </w:r>
+    </w:p>
+    <w:p>
+      <w:pPr>
+        <w:pStyle w:val="Heading1"/>
+      </w:pPr>
+      <w:r>
+        <w:rPr>
+          <w:color w:val="1A1A2E"/>
+        </w:rPr>
+        <w:t>PRQ — Pull Request</w:t>
+      </w:r>
+    </w:p>
+    <w:p>
+      <w:r>
+        <w:rPr>
+          <w:sz w:val="18"/>
+        </w:rPr>
+        <w:t>Tester: ____________    Date: ____________    Version: ____________</w:t>
+      </w:r>
+    </w:p>
+    <w:tbl>
+      <w:tblPr>
+        <w:tblStyle w:val="TableGrid"/>
+        <w:tblW w:type="auto" w:w="0"/>
+        <w:jc w:val="center"/>
+        <w:tblLayout w:type="autofit"/>
+        <w:tblLook w:firstColumn="1" w:firstRow="1" w:lastColumn="0" w:lastRow="0" w:noHBand="0" w:noVBand="1" w:val="04A0"/>
+      </w:tblPr>
+      <w:tblGrid>
+        <w:gridCol w:w="454"/>
+        <w:gridCol w:w="9071"/>
+        <w:gridCol w:w="1417"/>
+        <w:gridCol w:w="3402"/>
+      </w:tblGrid>
+      <w:tr>
+        <w:tc>
+          <w:tcPr>
+            <w:tcW w:type="dxa" w:w="3784"/>
+            <w:shd w:fill="1A1A2E" w:val="clear"/>
+          </w:tcPr>
+          <w:p>
+            <w:pPr>
+              <w:jc w:val="center"/>
+            </w:pPr>
+            <w:r>
+              <w:rPr>
+                <w:b/>
+                <w:color w:val="FFFFFF"/>
+                <w:sz w:val="18"/>
+              </w:rPr>
+              <w:t>#</w:t>
+            </w:r>
+          </w:p>
+        </w:tc>
+        <w:tc>
+          <w:tcPr>
+            <w:tcW w:type="dxa" w:w="3784"/>
+            <w:shd w:fill="1A1A2E" w:val="clear"/>
+          </w:tcPr>
+          <w:p>
+            <w:pPr>
+              <w:jc w:val="center"/>
+            </w:pPr>
+            <w:r>
+              <w:rPr>
+                <w:b/>
+                <w:color w:val="FFFFFF"/>
+                <w:sz w:val="18"/>
+              </w:rPr>
+              <w:t>Test Item</w:t>
+            </w:r>
+          </w:p>
+        </w:tc>
+        <w:tc>
+          <w:tcPr>
+            <w:tcW w:type="dxa" w:w="3784"/>
+            <w:shd w:fill="1A1A2E" w:val="clear"/>
+          </w:tcPr>
+          <w:p>
+            <w:pPr>
+              <w:jc w:val="center"/>
+            </w:pPr>
+            <w:r>
+              <w:rPr>
+                <w:b/>
+                <w:color w:val="FFFFFF"/>
+                <w:sz w:val="18"/>
+              </w:rPr>
+              <w:t>Status</w:t>
+            </w:r>
+          </w:p>
+        </w:tc>
+        <w:tc>
+          <w:tcPr>
+            <w:tcW w:type="dxa" w:w="3784"/>
+            <w:shd w:fill="1A1A2E" w:val="clear"/>
+          </w:tcPr>
+          <w:p>
+            <w:pPr>
+              <w:jc w:val="center"/>
+            </w:pPr>
+            <w:r>
+              <w:rPr>
+                <w:b/>
+                <w:color w:val="FFFFFF"/>
+                <w:sz w:val="18"/>
+              </w:rPr>
+              <w:t>Comments</w:t>
+            </w:r>
+          </w:p>
+        </w:tc>
+      </w:tr>
+      <w:tr>
+        <w:tc>
+          <w:tcPr>
+            <w:tcW w:type="dxa" w:w="454"/>
+          </w:tcPr>
+          <w:p>
+            <w:pPr>
+              <w:jc w:val="center"/>
+            </w:pPr>
+            <w:r>
+              <w:rPr>
+                <w:sz w:val="18"/>
+              </w:rPr>
+              <w:t>1</w:t>
+            </w:r>
+          </w:p>
+        </w:tc>
+        <w:tc>
+          <w:tcPr>
+            <w:tcW w:type="dxa" w:w="9071"/>
+          </w:tcPr>
+          <w:p>
+            <w:r>
+              <w:rPr>
+                <w:sz w:val="18"/>
+              </w:rPr>
+              <w:t>Navigate to /reporting/pull-request via Home button or jump code PRQ</w:t>
+            </w:r>
+          </w:p>
+        </w:tc>
+        <w:tc>
+          <w:tcPr>
+            <w:tcW w:type="dxa" w:w="1417"/>
+          </w:tcPr>
+          <w:p>
+            <w:pPr>
+              <w:jc w:val="center"/>
+            </w:pPr>
+          </w:p>
+        </w:tc>
+        <w:tc>
+          <w:tcPr>
+            <w:tcW w:type="dxa" w:w="3402"/>
+          </w:tcPr>
+          <w:p/>
+        </w:tc>
+      </w:tr>
+      <w:tr>
+        <w:tc>
+          <w:tcPr>
+            <w:tcW w:type="dxa" w:w="454"/>
+            <w:shd w:fill="F0F0F5" w:val="clear"/>
+          </w:tcPr>
+          <w:p>
+            <w:pPr>
+              <w:jc w:val="center"/>
+            </w:pPr>
+            <w:r>
+              <w:rPr>
+                <w:sz w:val="18"/>
+              </w:rPr>
+              <w:t>2</w:t>
+            </w:r>
+          </w:p>
+        </w:tc>
+        <w:tc>
+          <w:tcPr>
+            <w:tcW w:type="dxa" w:w="9071"/>
+            <w:shd w:fill="F0F0F5" w:val="clear"/>
+          </w:tcPr>
+          <w:p>
+            <w:r>
+              <w:rPr>
+                <w:sz w:val="18"/>
+              </w:rPr>
+              <w:t>Empty state: prompt displays until Aisle + Status are filled</w:t>
+            </w:r>
+          </w:p>
+        </w:tc>
+        <w:tc>
+          <w:tcPr>
+            <w:tcW w:type="dxa" w:w="1417"/>
+            <w:shd w:fill="F0F0F5" w:val="clear"/>
+          </w:tcPr>
+          <w:p>
+            <w:pPr>
+              <w:jc w:val="center"/>
+            </w:pPr>
+          </w:p>
+        </w:tc>
+        <w:tc>
+          <w:tcPr>
+            <w:tcW w:type="dxa" w:w="3402"/>
+            <w:shd w:fill="F0F0F5" w:val="clear"/>
+          </w:tcPr>
+          <w:p/>
+        </w:tc>
+      </w:tr>
+      <w:tr>
+        <w:tc>
+          <w:tcPr>
+            <w:tcW w:type="dxa" w:w="454"/>
+          </w:tcPr>
+          <w:p>
+            <w:pPr>
+              <w:jc w:val="center"/>
+            </w:pPr>
+            <w:r>
+              <w:rPr>
+                <w:sz w:val="18"/>
+              </w:rPr>
+              <w:t>3</w:t>
+            </w:r>
+          </w:p>
+        </w:tc>
+        <w:tc>
+          <w:tcPr>
+            <w:tcW w:type="dxa" w:w="9071"/>
+          </w:tcPr>
+          <w:p>
+            <w:r>
+              <w:rPr>
+                <w:sz w:val="18"/>
+              </w:rPr>
+              <w:t>Aisle field: 3-digit numpad entry, existence check via useAisleField</w:t>
+            </w:r>
+          </w:p>
+        </w:tc>
+        <w:tc>
+          <w:tcPr>
+            <w:tcW w:type="dxa" w:w="1417"/>
+          </w:tcPr>
+          <w:p>
+            <w:pPr>
+              <w:jc w:val="center"/>
+            </w:pPr>
+          </w:p>
+        </w:tc>
+        <w:tc>
+          <w:tcPr>
+            <w:tcW w:type="dxa" w:w="3402"/>
+          </w:tcPr>
+          <w:p/>
+        </w:tc>
+      </w:tr>
+      <w:tr>
+        <w:tc>
+          <w:tcPr>
+            <w:tcW w:type="dxa" w:w="454"/>
+            <w:shd w:fill="F0F0F5" w:val="clear"/>
+          </w:tcPr>
+          <w:p>
+            <w:pPr>
+              <w:jc w:val="center"/>
+            </w:pPr>
+            <w:r>
+              <w:rPr>
+                <w:sz w:val="18"/>
+              </w:rPr>
+              <w:t>4</w:t>
+            </w:r>
+          </w:p>
+        </w:tc>
+        <w:tc>
+          <w:tcPr>
+            <w:tcW w:type="dxa" w:w="9071"/>
+            <w:shd w:fill="F0F0F5" w:val="clear"/>
+          </w:tcPr>
+          <w:p>
+            <w:r>
+              <w:rPr>
+                <w:sz w:val="18"/>
+              </w:rPr>
+              <w:t>End Aisle field: validates higher than Start Aisle, shows error if not</w:t>
+            </w:r>
+          </w:p>
+        </w:tc>
+        <w:tc>
+          <w:tcPr>
+            <w:tcW w:type="dxa" w:w="1417"/>
+            <w:shd w:fill="F0F0F5" w:val="clear"/>
+          </w:tcPr>
+          <w:p>
+            <w:pPr>
+              <w:jc w:val="center"/>
+            </w:pPr>
+          </w:p>
+        </w:tc>
+        <w:tc>
+          <w:tcPr>
+            <w:tcW w:type="dxa" w:w="3402"/>
+            <w:shd w:fill="F0F0F5" w:val="clear"/>
+          </w:tcPr>
+          <w:p/>
+        </w:tc>
+      </w:tr>
+      <w:tr>
+        <w:tc>
+          <w:tcPr>
+            <w:tcW w:type="dxa" w:w="454"/>
+          </w:tcPr>
+          <w:p>
+            <w:pPr>
+              <w:jc w:val="center"/>
+            </w:pPr>
+            <w:r>
+              <w:rPr>
+                <w:sz w:val="18"/>
+              </w:rPr>
+              <w:t>5</w:t>
+            </w:r>
+          </w:p>
+        </w:tc>
+        <w:tc>
+          <w:tcPr>
+            <w:tcW w:type="dxa" w:w="9071"/>
+          </w:tcPr>
+          <w:p>
+            <w:r>
+              <w:rPr>
+                <w:sz w:val="18"/>
+              </w:rPr>
+              <w:t>Workstation field: entering clears Aisle fields (mutual exclusion)</w:t>
+            </w:r>
+          </w:p>
+        </w:tc>
+        <w:tc>
+          <w:tcPr>
+            <w:tcW w:type="dxa" w:w="1417"/>
+          </w:tcPr>
+          <w:p>
+            <w:pPr>
+              <w:jc w:val="center"/>
+            </w:pPr>
+          </w:p>
+        </w:tc>
+        <w:tc>
+          <w:tcPr>
+            <w:tcW w:type="dxa" w:w="3402"/>
+          </w:tcPr>
+          <w:p/>
+        </w:tc>
+      </w:tr>
+      <w:tr>
+        <w:tc>
+          <w:tcPr>
+            <w:tcW w:type="dxa" w:w="454"/>
+            <w:shd w:fill="F0F0F5" w:val="clear"/>
+          </w:tcPr>
+          <w:p>
+            <w:pPr>
+              <w:jc w:val="center"/>
+            </w:pPr>
+            <w:r>
+              <w:rPr>
+                <w:sz w:val="18"/>
+              </w:rPr>
+              <w:t>6</w:t>
+            </w:r>
+          </w:p>
+        </w:tc>
+        <w:tc>
+          <w:tcPr>
+            <w:tcW w:type="dxa" w:w="9071"/>
+            <w:shd w:fill="F0F0F5" w:val="clear"/>
+          </w:tcPr>
+          <w:p>
+            <w:r>
+              <w:rPr>
+                <w:sz w:val="18"/>
+              </w:rPr>
+              <w:t>Aisle entry clears Workstation field (mutual exclusion)</w:t>
+            </w:r>
+          </w:p>
+        </w:tc>
+        <w:tc>
+          <w:tcPr>
+            <w:tcW w:type="dxa" w:w="1417"/>
+            <w:shd w:fill="F0F0F5" w:val="clear"/>
+          </w:tcPr>
+          <w:p>
+            <w:pPr>
+              <w:jc w:val="center"/>
+            </w:pPr>
+          </w:p>
+        </w:tc>
+        <w:tc>
+          <w:tcPr>
+            <w:tcW w:type="dxa" w:w="3402"/>
+            <w:shd w:fill="F0F0F5" w:val="clear"/>
+          </w:tcPr>
+          <w:p/>
+        </w:tc>
+      </w:tr>
+      <w:tr>
+        <w:tc>
+          <w:tcPr>
+            <w:tcW w:type="dxa" w:w="454"/>
+          </w:tcPr>
+          <w:p>
+            <w:pPr>
+              <w:jc w:val="center"/>
+            </w:pPr>
+            <w:r>
+              <w:rPr>
+                <w:sz w:val="18"/>
+              </w:rPr>
+              <w:t>7</w:t>
+            </w:r>
+          </w:p>
+        </w:tc>
+        <w:tc>
+          <w:tcPr>
+            <w:tcW w:type="dxa" w:w="9071"/>
+          </w:tcPr>
+          <w:p>
+            <w:r>
+              <w:rPr>
+                <w:sz w:val="18"/>
+              </w:rPr>
+              <w:t>Status dropdown: only Available, Printed, Verified options</w:t>
+            </w:r>
+          </w:p>
+        </w:tc>
+        <w:tc>
+          <w:tcPr>
+            <w:tcW w:type="dxa" w:w="1417"/>
+          </w:tcPr>
+          <w:p>
+            <w:pPr>
+              <w:jc w:val="center"/>
+            </w:pPr>
+          </w:p>
+        </w:tc>
+        <w:tc>
+          <w:tcPr>
+            <w:tcW w:type="dxa" w:w="3402"/>
+          </w:tcPr>
+          <w:p/>
+        </w:tc>
+      </w:tr>
+      <w:tr>
+        <w:tc>
+          <w:tcPr>
+            <w:tcW w:type="dxa" w:w="454"/>
+            <w:shd w:fill="F0F0F5" w:val="clear"/>
+          </w:tcPr>
+          <w:p>
+            <w:pPr>
+              <w:jc w:val="center"/>
+            </w:pPr>
+            <w:r>
+              <w:rPr>
+                <w:sz w:val="18"/>
+              </w:rPr>
+              <w:t>8</w:t>
+            </w:r>
+          </w:p>
+        </w:tc>
+        <w:tc>
+          <w:tcPr>
+            <w:tcW w:type="dxa" w:w="9071"/>
+            <w:shd w:fill="F0F0F5" w:val="clear"/>
+          </w:tcPr>
+          <w:p>
+            <w:r>
+              <w:rPr>
+                <w:sz w:val="18"/>
+              </w:rPr>
+              <w:t>Live filtering: results populate as soon as Aisle + Status are valid</w:t>
+            </w:r>
+          </w:p>
+        </w:tc>
+        <w:tc>
+          <w:tcPr>
+            <w:tcW w:type="dxa" w:w="1417"/>
+            <w:shd w:fill="F0F0F5" w:val="clear"/>
+          </w:tcPr>
+          <w:p>
+            <w:pPr>
+              <w:jc w:val="center"/>
+            </w:pPr>
+          </w:p>
+        </w:tc>
+        <w:tc>
+          <w:tcPr>
+            <w:tcW w:type="dxa" w:w="3402"/>
+            <w:shd w:fill="F0F0F5" w:val="clear"/>
+          </w:tcPr>
+          <w:p/>
+        </w:tc>
+      </w:tr>
+      <w:tr>
+        <w:tc>
+          <w:tcPr>
+            <w:tcW w:type="dxa" w:w="454"/>
+          </w:tcPr>
+          <w:p>
+            <w:pPr>
+              <w:jc w:val="center"/>
+            </w:pPr>
+            <w:r>
+              <w:rPr>
+                <w:sz w:val="18"/>
+              </w:rPr>
+              <w:t>9</w:t>
+            </w:r>
+          </w:p>
+        </w:tc>
+        <w:tc>
+          <w:tcPr>
+            <w:tcW w:type="dxa" w:w="9071"/>
+          </w:tcPr>
+          <w:p>
+            <w:r>
+              <w:rPr>
+                <w:sz w:val="18"/>
+              </w:rPr>
+              <w:t>L1 summary: rows grouped by Batch Date × Pull Function</w:t>
+            </w:r>
+          </w:p>
+        </w:tc>
+        <w:tc>
+          <w:tcPr>
+            <w:tcW w:type="dxa" w:w="1417"/>
+          </w:tcPr>
+          <w:p>
+            <w:pPr>
+              <w:jc w:val="center"/>
+            </w:pPr>
+          </w:p>
+        </w:tc>
+        <w:tc>
+          <w:tcPr>
+            <w:tcW w:type="dxa" w:w="3402"/>
+          </w:tcPr>
+          <w:p/>
+        </w:tc>
+      </w:tr>
+      <w:tr>
+        <w:tc>
+          <w:tcPr>
+            <w:tcW w:type="dxa" w:w="454"/>
+            <w:shd w:fill="F0F0F5" w:val="clear"/>
+          </w:tcPr>
+          <w:p>
+            <w:pPr>
+              <w:jc w:val="center"/>
+            </w:pPr>
+            <w:r>
+              <w:rPr>
+                <w:sz w:val="18"/>
+              </w:rPr>
+              <w:t>10</w:t>
+            </w:r>
+          </w:p>
+        </w:tc>
+        <w:tc>
+          <w:tcPr>
+            <w:tcW w:type="dxa" w:w="9071"/>
+            <w:shd w:fill="F0F0F5" w:val="clear"/>
+          </w:tcPr>
+          <w:p>
+            <w:r>
+              <w:rPr>
+                <w:sz w:val="18"/>
+              </w:rPr>
+              <w:t>L1 sort: Batch Date ascending, then function order CA → CF → FP → BK</w:t>
+            </w:r>
+          </w:p>
+        </w:tc>
+        <w:tc>
+          <w:tcPr>
+            <w:tcW w:type="dxa" w:w="1417"/>
+            <w:shd w:fill="F0F0F5" w:val="clear"/>
+          </w:tcPr>
+          <w:p>
+            <w:pPr>
+              <w:jc w:val="center"/>
+            </w:pPr>
+          </w:p>
+        </w:tc>
+        <w:tc>
+          <w:tcPr>
+            <w:tcW w:type="dxa" w:w="3402"/>
+            <w:shd w:fill="F0F0F5" w:val="clear"/>
+          </w:tcPr>
+          <w:p/>
+        </w:tc>
+      </w:tr>
+      <w:tr>
+        <w:tc>
+          <w:tcPr>
+            <w:tcW w:type="dxa" w:w="454"/>
+          </w:tcPr>
+          <w:p>
+            <w:pPr>
+              <w:jc w:val="center"/>
+            </w:pPr>
+            <w:r>
+              <w:rPr>
+                <w:sz w:val="18"/>
+              </w:rPr>
+              <w:t>11</w:t>
+            </w:r>
+          </w:p>
+        </w:tc>
+        <w:tc>
+          <w:tcPr>
+            <w:tcW w:type="dxa" w:w="9071"/>
+          </w:tcPr>
+          <w:p>
+            <w:r>
+              <w:rPr>
+                <w:sz w:val="18"/>
+              </w:rPr>
+              <w:t>L1 CA/CF/FP row: Cartons, Locations, Density fields display</w:t>
+            </w:r>
+          </w:p>
+        </w:tc>
+        <w:tc>
+          <w:tcPr>
+            <w:tcW w:type="dxa" w:w="1417"/>
+          </w:tcPr>
+          <w:p>
+            <w:pPr>
+              <w:jc w:val="center"/>
+            </w:pPr>
+          </w:p>
+        </w:tc>
+        <w:tc>
+          <w:tcPr>
+            <w:tcW w:type="dxa" w:w="3402"/>
+          </w:tcPr>
+          <w:p/>
+        </w:tc>
+      </w:tr>
+      <w:tr>
+        <w:tc>
+          <w:tcPr>
+            <w:tcW w:type="dxa" w:w="454"/>
+            <w:shd w:fill="F0F0F5" w:val="clear"/>
+          </w:tcPr>
+          <w:p>
+            <w:pPr>
+              <w:jc w:val="center"/>
+            </w:pPr>
+            <w:r>
+              <w:rPr>
+                <w:sz w:val="18"/>
+              </w:rPr>
+              <w:t>12</w:t>
+            </w:r>
+          </w:p>
+        </w:tc>
+        <w:tc>
+          <w:tcPr>
+            <w:tcW w:type="dxa" w:w="9071"/>
+            <w:shd w:fill="F0F0F5" w:val="clear"/>
+          </w:tcPr>
+          <w:p>
+            <w:r>
+              <w:rPr>
+                <w:sz w:val="18"/>
+              </w:rPr>
+              <w:t>L1 BK row: Full Pallets, Pallet Density, Loose Cartons, Carton Density, Locations</w:t>
+            </w:r>
+          </w:p>
+        </w:tc>
+        <w:tc>
+          <w:tcPr>
+            <w:tcW w:type="dxa" w:w="1417"/>
+            <w:shd w:fill="F0F0F5" w:val="clear"/>
+          </w:tcPr>
+          <w:p>
+            <w:pPr>
+              <w:jc w:val="center"/>
+            </w:pPr>
+          </w:p>
+        </w:tc>
+        <w:tc>
+          <w:tcPr>
+            <w:tcW w:type="dxa" w:w="3402"/>
+            <w:shd w:fill="F0F0F5" w:val="clear"/>
+          </w:tcPr>
+          <w:p/>
+        </w:tc>
+      </w:tr>
+      <w:tr>
+        <w:tc>
+          <w:tcPr>
+            <w:tcW w:type="dxa" w:w="454"/>
+          </w:tcPr>
+          <w:p>
+            <w:pPr>
+              <w:jc w:val="center"/>
+            </w:pPr>
+            <w:r>
+              <w:rPr>
+                <w:sz w:val="18"/>
+              </w:rPr>
+              <w:t>13</w:t>
+            </w:r>
+          </w:p>
+        </w:tc>
+        <w:tc>
+          <w:tcPr>
+            <w:tcW w:type="dxa" w:w="9071"/>
+          </w:tcPr>
+          <w:p>
+            <w:r>
+              <w:rPr>
+                <w:sz w:val="18"/>
+              </w:rPr>
+              <w:t>Select-then-zoom-in: tap highlights row, Zoom In button or double-tap drills</w:t>
+            </w:r>
+          </w:p>
+        </w:tc>
+        <w:tc>
+          <w:tcPr>
+            <w:tcW w:type="dxa" w:w="1417"/>
+          </w:tcPr>
+          <w:p>
+            <w:pPr>
+              <w:jc w:val="center"/>
+            </w:pPr>
+          </w:p>
+        </w:tc>
+        <w:tc>
+          <w:tcPr>
+            <w:tcW w:type="dxa" w:w="3402"/>
+          </w:tcPr>
+          <w:p/>
+        </w:tc>
+      </w:tr>
+      <w:tr>
+        <w:tc>
+          <w:tcPr>
+            <w:tcW w:type="dxa" w:w="454"/>
+            <w:shd w:fill="F0F0F5" w:val="clear"/>
+          </w:tcPr>
+          <w:p>
+            <w:pPr>
+              <w:jc w:val="center"/>
+            </w:pPr>
+            <w:r>
+              <w:rPr>
+                <w:sz w:val="18"/>
+              </w:rPr>
+              <w:t>14</w:t>
+            </w:r>
+          </w:p>
+        </w:tc>
+        <w:tc>
+          <w:tcPr>
+            <w:tcW w:type="dxa" w:w="9071"/>
+            <w:shd w:fill="F0F0F5" w:val="clear"/>
+          </w:tcPr>
+          <w:p>
+            <w:r>
+              <w:rPr>
+                <w:sz w:val="18"/>
+              </w:rPr>
+              <w:t>L1 → L2 (range/workstation): per-aisle breakdown shows for selected batch/function</w:t>
+            </w:r>
+          </w:p>
+        </w:tc>
+        <w:tc>
+          <w:tcPr>
+            <w:tcW w:type="dxa" w:w="1417"/>
+            <w:shd w:fill="F0F0F5" w:val="clear"/>
+          </w:tcPr>
+          <w:p>
+            <w:pPr>
+              <w:jc w:val="center"/>
+            </w:pPr>
+          </w:p>
+        </w:tc>
+        <w:tc>
+          <w:tcPr>
+            <w:tcW w:type="dxa" w:w="3402"/>
+            <w:shd w:fill="F0F0F5" w:val="clear"/>
+          </w:tcPr>
+          <w:p/>
+        </w:tc>
+      </w:tr>
+      <w:tr>
+        <w:tc>
+          <w:tcPr>
+            <w:tcW w:type="dxa" w:w="454"/>
+          </w:tcPr>
+          <w:p>
+            <w:pPr>
+              <w:jc w:val="center"/>
+            </w:pPr>
+            <w:r>
+              <w:rPr>
+                <w:sz w:val="18"/>
+              </w:rPr>
+              <w:t>15</w:t>
+            </w:r>
+          </w:p>
+        </w:tc>
+        <w:tc>
+          <w:tcPr>
+            <w:tcW w:type="dxa" w:w="9071"/>
+          </w:tcPr>
+          <w:p>
+            <w:r>
+              <w:rPr>
+                <w:sz w:val="18"/>
+              </w:rPr>
+              <w:t>L1 → L3 (single aisle): skips L2, goes directly to location-level</w:t>
+            </w:r>
+          </w:p>
+        </w:tc>
+        <w:tc>
+          <w:tcPr>
+            <w:tcW w:type="dxa" w:w="1417"/>
+          </w:tcPr>
+          <w:p>
+            <w:pPr>
+              <w:jc w:val="center"/>
+            </w:pPr>
+          </w:p>
+        </w:tc>
+        <w:tc>
+          <w:tcPr>
+            <w:tcW w:type="dxa" w:w="3402"/>
+          </w:tcPr>
+          <w:p/>
+        </w:tc>
+      </w:tr>
+      <w:tr>
+        <w:tc>
+          <w:tcPr>
+            <w:tcW w:type="dxa" w:w="454"/>
+            <w:shd w:fill="F0F0F5" w:val="clear"/>
+          </w:tcPr>
+          <w:p>
+            <w:pPr>
+              <w:jc w:val="center"/>
+            </w:pPr>
+            <w:r>
+              <w:rPr>
+                <w:sz w:val="18"/>
+              </w:rPr>
+              <w:t>16</w:t>
+            </w:r>
+          </w:p>
+        </w:tc>
+        <w:tc>
+          <w:tcPr>
+            <w:tcW w:type="dxa" w:w="9071"/>
+            <w:shd w:fill="F0F0F5" w:val="clear"/>
+          </w:tcPr>
+          <w:p>
+            <w:r>
+              <w:rPr>
+                <w:sz w:val="18"/>
+              </w:rPr>
+              <w:t>L2 per-aisle: same field format as L1, scoped to one aisle</w:t>
+            </w:r>
+          </w:p>
+        </w:tc>
+        <w:tc>
+          <w:tcPr>
+            <w:tcW w:type="dxa" w:w="1417"/>
+            <w:shd w:fill="F0F0F5" w:val="clear"/>
+          </w:tcPr>
+          <w:p>
+            <w:pPr>
+              <w:jc w:val="center"/>
+            </w:pPr>
+          </w:p>
+        </w:tc>
+        <w:tc>
+          <w:tcPr>
+            <w:tcW w:type="dxa" w:w="3402"/>
+            <w:shd w:fill="F0F0F5" w:val="clear"/>
+          </w:tcPr>
+          <w:p/>
+        </w:tc>
+      </w:tr>
+      <w:tr>
+        <w:tc>
+          <w:tcPr>
+            <w:tcW w:type="dxa" w:w="454"/>
+          </w:tcPr>
+          <w:p>
+            <w:pPr>
+              <w:jc w:val="center"/>
+            </w:pPr>
+            <w:r>
+              <w:rPr>
+                <w:sz w:val="18"/>
+              </w:rPr>
+              <w:t>17</w:t>
+            </w:r>
+          </w:p>
+        </w:tc>
+        <w:tc>
+          <w:tcPr>
+            <w:tcW w:type="dxa" w:w="9071"/>
+          </w:tcPr>
+          <w:p>
+            <w:r>
+              <w:rPr>
+                <w:sz w:val="18"/>
+              </w:rPr>
+              <w:t>L2 → L3: zoom into selected aisle row</w:t>
+            </w:r>
+          </w:p>
+        </w:tc>
+        <w:tc>
+          <w:tcPr>
+            <w:tcW w:type="dxa" w:w="1417"/>
+          </w:tcPr>
+          <w:p>
+            <w:pPr>
+              <w:jc w:val="center"/>
+            </w:pPr>
+          </w:p>
+        </w:tc>
+        <w:tc>
+          <w:tcPr>
+            <w:tcW w:type="dxa" w:w="3402"/>
+          </w:tcPr>
+          <w:p/>
+        </w:tc>
+      </w:tr>
+      <w:tr>
+        <w:tc>
+          <w:tcPr>
+            <w:tcW w:type="dxa" w:w="454"/>
+            <w:shd w:fill="F0F0F5" w:val="clear"/>
+          </w:tcPr>
+          <w:p>
+            <w:pPr>
+              <w:jc w:val="center"/>
+            </w:pPr>
+            <w:r>
+              <w:rPr>
+                <w:sz w:val="18"/>
+              </w:rPr>
+              <w:t>18</w:t>
+            </w:r>
+          </w:p>
+        </w:tc>
+        <w:tc>
+          <w:tcPr>
+            <w:tcW w:type="dxa" w:w="9071"/>
+            <w:shd w:fill="F0F0F5" w:val="clear"/>
+          </w:tcPr>
+          <w:p>
+            <w:r>
+              <w:rPr>
+                <w:sz w:val="18"/>
+              </w:rPr>
+              <w:t>L3 location-level: rows show Aisle-Bin-Level with Cartons/Pallets/SSPs</w:t>
+            </w:r>
+          </w:p>
+        </w:tc>
+        <w:tc>
+          <w:tcPr>
+            <w:tcW w:type="dxa" w:w="1417"/>
+            <w:shd w:fill="F0F0F5" w:val="clear"/>
+          </w:tcPr>
+          <w:p>
+            <w:pPr>
+              <w:jc w:val="center"/>
+            </w:pPr>
+          </w:p>
+        </w:tc>
+        <w:tc>
+          <w:tcPr>
+            <w:tcW w:type="dxa" w:w="3402"/>
+            <w:shd w:fill="F0F0F5" w:val="clear"/>
+          </w:tcPr>
+          <w:p/>
+        </w:tc>
+      </w:tr>
+      <w:tr>
+        <w:tc>
+          <w:tcPr>
+            <w:tcW w:type="dxa" w:w="454"/>
+          </w:tcPr>
+          <w:p>
+            <w:pPr>
+              <w:jc w:val="center"/>
+            </w:pPr>
+            <w:r>
+              <w:rPr>
+                <w:sz w:val="18"/>
+              </w:rPr>
+              <w:t>19</w:t>
+            </w:r>
+          </w:p>
+        </w:tc>
+        <w:tc>
+          <w:tcPr>
+            <w:tcW w:type="dxa" w:w="9071"/>
+          </w:tcPr>
+          <w:p>
+            <w:r>
+              <w:rPr>
+                <w:sz w:val="18"/>
+              </w:rPr>
+              <w:t>L3 additional filters: Bin Start, Bin End, Level</w:t>
+            </w:r>
+          </w:p>
+        </w:tc>
+        <w:tc>
+          <w:tcPr>
+            <w:tcW w:type="dxa" w:w="1417"/>
+          </w:tcPr>
+          <w:p>
+            <w:pPr>
+              <w:jc w:val="center"/>
+            </w:pPr>
+          </w:p>
+        </w:tc>
+        <w:tc>
+          <w:tcPr>
+            <w:tcW w:type="dxa" w:w="3402"/>
+          </w:tcPr>
+          <w:p/>
+        </w:tc>
+      </w:tr>
+      <w:tr>
+        <w:tc>
+          <w:tcPr>
+            <w:tcW w:type="dxa" w:w="454"/>
+            <w:shd w:fill="F0F0F5" w:val="clear"/>
+          </w:tcPr>
+          <w:p>
+            <w:pPr>
+              <w:jc w:val="center"/>
+            </w:pPr>
+            <w:r>
+              <w:rPr>
+                <w:sz w:val="18"/>
+              </w:rPr>
+              <w:t>20</w:t>
+            </w:r>
+          </w:p>
+        </w:tc>
+        <w:tc>
+          <w:tcPr>
+            <w:tcW w:type="dxa" w:w="9071"/>
+            <w:shd w:fill="F0F0F5" w:val="clear"/>
+          </w:tcPr>
+          <w:p>
+            <w:r>
+              <w:rPr>
+                <w:sz w:val="18"/>
+              </w:rPr>
+              <w:t>L3 sort: Aisle, Bin, Level ascending</w:t>
+            </w:r>
+          </w:p>
+        </w:tc>
+        <w:tc>
+          <w:tcPr>
+            <w:tcW w:type="dxa" w:w="1417"/>
+            <w:shd w:fill="F0F0F5" w:val="clear"/>
+          </w:tcPr>
+          <w:p>
+            <w:pPr>
+              <w:jc w:val="center"/>
+            </w:pPr>
+          </w:p>
+        </w:tc>
+        <w:tc>
+          <w:tcPr>
+            <w:tcW w:type="dxa" w:w="3402"/>
+            <w:shd w:fill="F0F0F5" w:val="clear"/>
+          </w:tcPr>
+          <w:p/>
+        </w:tc>
+      </w:tr>
+      <w:tr>
+        <w:tc>
+          <w:tcPr>
+            <w:tcW w:type="dxa" w:w="454"/>
+          </w:tcPr>
+          <w:p>
+            <w:pPr>
+              <w:jc w:val="center"/>
+            </w:pPr>
+            <w:r>
+              <w:rPr>
+                <w:sz w:val="18"/>
+              </w:rPr>
+              <w:t>21</w:t>
+            </w:r>
+          </w:p>
+        </w:tc>
+        <w:tc>
+          <w:tcPr>
+            <w:tcW w:type="dxa" w:w="9071"/>
+          </w:tcPr>
+          <w:p>
+            <w:r>
+              <w:rPr>
+                <w:sz w:val="18"/>
+              </w:rPr>
+              <w:t>Back button: returns to previous level, clears selection</w:t>
+            </w:r>
+          </w:p>
+        </w:tc>
+        <w:tc>
+          <w:tcPr>
+            <w:tcW w:type="dxa" w:w="1417"/>
+          </w:tcPr>
+          <w:p>
+            <w:pPr>
+              <w:jc w:val="center"/>
+            </w:pPr>
+          </w:p>
+        </w:tc>
+        <w:tc>
+          <w:tcPr>
+            <w:tcW w:type="dxa" w:w="3402"/>
+          </w:tcPr>
+          <w:p/>
+        </w:tc>
+      </w:tr>
+      <w:tr>
+        <w:tc>
+          <w:tcPr>
+            <w:tcW w:type="dxa" w:w="454"/>
+            <w:shd w:fill="F0F0F5" w:val="clear"/>
+          </w:tcPr>
+          <w:p>
+            <w:pPr>
+              <w:jc w:val="center"/>
+            </w:pPr>
+            <w:r>
+              <w:rPr>
+                <w:sz w:val="18"/>
+              </w:rPr>
+              <w:t>22</w:t>
+            </w:r>
+          </w:p>
+        </w:tc>
+        <w:tc>
+          <w:tcPr>
+            <w:tcW w:type="dxa" w:w="9071"/>
+            <w:shd w:fill="F0F0F5" w:val="clear"/>
+          </w:tcPr>
+          <w:p>
+            <w:r>
+              <w:rPr>
+                <w:sz w:val="18"/>
+              </w:rPr>
+              <w:t>Zoom In button: disabled when no row selected</w:t>
+            </w:r>
+          </w:p>
+        </w:tc>
+        <w:tc>
+          <w:tcPr>
+            <w:tcW w:type="dxa" w:w="1417"/>
+            <w:shd w:fill="F0F0F5" w:val="clear"/>
+          </w:tcPr>
+          <w:p>
+            <w:pPr>
+              <w:jc w:val="center"/>
+            </w:pPr>
+          </w:p>
+        </w:tc>
+        <w:tc>
+          <w:tcPr>
+            <w:tcW w:type="dxa" w:w="3402"/>
+            <w:shd w:fill="F0F0F5" w:val="clear"/>
+          </w:tcPr>
+          <w:p/>
+        </w:tc>
+      </w:tr>
+      <w:tr>
+        <w:tc>
+          <w:tcPr>
+            <w:tcW w:type="dxa" w:w="454"/>
+          </w:tcPr>
+          <w:p>
+            <w:pPr>
+              <w:jc w:val="center"/>
+            </w:pPr>
+            <w:r>
+              <w:rPr>
+                <w:sz w:val="18"/>
+              </w:rPr>
+              <w:t>23</w:t>
+            </w:r>
+          </w:p>
+        </w:tc>
+        <w:tc>
+          <w:tcPr>
+            <w:tcW w:type="dxa" w:w="9071"/>
+          </w:tcPr>
+          <w:p>
+            <w:r>
+              <w:rPr>
+                <w:sz w:val="18"/>
+              </w:rPr>
+              <w:t>Summary line updates at every level showing current scope</w:t>
+            </w:r>
+          </w:p>
+        </w:tc>
+        <w:tc>
+          <w:tcPr>
+            <w:tcW w:type="dxa" w:w="1417"/>
+          </w:tcPr>
+          <w:p>
+            <w:pPr>
+              <w:jc w:val="center"/>
+            </w:pPr>
+          </w:p>
+        </w:tc>
+        <w:tc>
+          <w:tcPr>
+            <w:tcW w:type="dxa" w:w="3402"/>
+          </w:tcPr>
+          <w:p/>
+        </w:tc>
+      </w:tr>
+      <w:tr>
+        <w:tc>
+          <w:tcPr>
+            <w:tcW w:type="dxa" w:w="454"/>
+            <w:shd w:fill="F0F0F5" w:val="clear"/>
+          </w:tcPr>
+          <w:p>
+            <w:pPr>
+              <w:jc w:val="center"/>
+            </w:pPr>
+            <w:r>
+              <w:rPr>
+                <w:sz w:val="18"/>
+              </w:rPr>
+              <w:t>24</w:t>
+            </w:r>
+          </w:p>
+        </w:tc>
+        <w:tc>
+          <w:tcPr>
+            <w:tcW w:type="dxa" w:w="9071"/>
+            <w:shd w:fill="F0F0F5" w:val="clear"/>
+          </w:tcPr>
+          <w:p>
+            <w:r>
+              <w:rPr>
+                <w:sz w:val="18"/>
+              </w:rPr>
+              <w:t>Pull detail popup: opens on L3 zoom-in</w:t>
+            </w:r>
+          </w:p>
+        </w:tc>
+        <w:tc>
+          <w:tcPr>
+            <w:tcW w:type="dxa" w:w="1417"/>
+            <w:shd w:fill="F0F0F5" w:val="clear"/>
+          </w:tcPr>
+          <w:p>
+            <w:pPr>
+              <w:jc w:val="center"/>
+            </w:pPr>
+          </w:p>
+        </w:tc>
+        <w:tc>
+          <w:tcPr>
+            <w:tcW w:type="dxa" w:w="3402"/>
+            <w:shd w:fill="F0F0F5" w:val="clear"/>
+          </w:tcPr>
+          <w:p/>
+        </w:tc>
+      </w:tr>
+      <w:tr>
+        <w:tc>
+          <w:tcPr>
+            <w:tcW w:type="dxa" w:w="454"/>
+          </w:tcPr>
+          <w:p>
+            <w:pPr>
+              <w:jc w:val="center"/>
+            </w:pPr>
+            <w:r>
+              <w:rPr>
+                <w:sz w:val="18"/>
+              </w:rPr>
+              <w:t>25</w:t>
+            </w:r>
+          </w:p>
+        </w:tc>
+        <w:tc>
+          <w:tcPr>
+            <w:tcW w:type="dxa" w:w="9071"/>
+          </w:tcPr>
+          <w:p>
+            <w:r>
+              <w:rPr>
+                <w:sz w:val="18"/>
+              </w:rPr>
+              <w:t>Popup header: tappable Location → LII, DPCI → IID, Pallet ID → PII</w:t>
+            </w:r>
+          </w:p>
+        </w:tc>
+        <w:tc>
+          <w:tcPr>
+            <w:tcW w:type="dxa" w:w="1417"/>
+          </w:tcPr>
+          <w:p>
+            <w:pPr>
+              <w:jc w:val="center"/>
+            </w:pPr>
+          </w:p>
+        </w:tc>
+        <w:tc>
+          <w:tcPr>
+            <w:tcW w:type="dxa" w:w="3402"/>
+          </w:tcPr>
+          <w:p/>
+        </w:tc>
+      </w:tr>
+      <w:tr>
+        <w:tc>
+          <w:tcPr>
+            <w:tcW w:type="dxa" w:w="454"/>
+            <w:shd w:fill="F0F0F5" w:val="clear"/>
+          </w:tcPr>
+          <w:p>
+            <w:pPr>
+              <w:jc w:val="center"/>
+            </w:pPr>
+            <w:r>
+              <w:rPr>
+                <w:sz w:val="18"/>
+              </w:rPr>
+              <w:t>26</w:t>
+            </w:r>
+          </w:p>
+        </w:tc>
+        <w:tc>
+          <w:tcPr>
+            <w:tcW w:type="dxa" w:w="9071"/>
+            <w:shd w:fill="F0F0F5" w:val="clear"/>
+          </w:tcPr>
+          <w:p>
+            <w:r>
+              <w:rPr>
+                <w:sz w:val="18"/>
+              </w:rPr>
+              <w:t>Popup pull metadata: pull type, batch date, pull quantity</w:t>
+            </w:r>
+          </w:p>
+        </w:tc>
+        <w:tc>
+          <w:tcPr>
+            <w:tcW w:type="dxa" w:w="1417"/>
+            <w:shd w:fill="F0F0F5" w:val="clear"/>
+          </w:tcPr>
+          <w:p>
+            <w:pPr>
+              <w:jc w:val="center"/>
+            </w:pPr>
+          </w:p>
+        </w:tc>
+        <w:tc>
+          <w:tcPr>
+            <w:tcW w:type="dxa" w:w="3402"/>
+            <w:shd w:fill="F0F0F5" w:val="clear"/>
+          </w:tcPr>
+          <w:p/>
+        </w:tc>
+      </w:tr>
+      <w:tr>
+        <w:tc>
+          <w:tcPr>
+            <w:tcW w:type="dxa" w:w="454"/>
+          </w:tcPr>
+          <w:p>
+            <w:pPr>
+              <w:jc w:val="center"/>
+            </w:pPr>
+            <w:r>
+              <w:rPr>
+                <w:sz w:val="18"/>
+              </w:rPr>
+              <w:t>27</w:t>
+            </w:r>
+          </w:p>
+        </w:tc>
+        <w:tc>
+          <w:tcPr>
+            <w:tcW w:type="dxa" w:w="9071"/>
+          </w:tcPr>
+          <w:p>
+            <w:r>
+              <w:rPr>
+                <w:sz w:val="18"/>
+              </w:rPr>
+              <w:t>Popup container list: each CID with status badge and quantity</w:t>
+            </w:r>
+          </w:p>
+        </w:tc>
+        <w:tc>
+          <w:tcPr>
+            <w:tcW w:type="dxa" w:w="1417"/>
+          </w:tcPr>
+          <w:p>
+            <w:pPr>
+              <w:jc w:val="center"/>
+            </w:pPr>
+          </w:p>
+        </w:tc>
+        <w:tc>
+          <w:tcPr>
+            <w:tcW w:type="dxa" w:w="3402"/>
+          </w:tcPr>
+          <w:p/>
+        </w:tc>
+      </w:tr>
+      <w:tr>
+        <w:tc>
+          <w:tcPr>
+            <w:tcW w:type="dxa" w:w="454"/>
+            <w:shd w:fill="F0F0F5" w:val="clear"/>
+          </w:tcPr>
+          <w:p>
+            <w:pPr>
+              <w:jc w:val="center"/>
+            </w:pPr>
+            <w:r>
+              <w:rPr>
+                <w:sz w:val="18"/>
+              </w:rPr>
+              <w:t>28</w:t>
+            </w:r>
+          </w:p>
+        </w:tc>
+        <w:tc>
+          <w:tcPr>
+            <w:tcW w:type="dxa" w:w="9071"/>
+            <w:shd w:fill="F0F0F5" w:val="clear"/>
+          </w:tcPr>
+          <w:p>
+            <w:r>
+              <w:rPr>
+                <w:sz w:val="18"/>
+              </w:rPr>
+              <w:t>Tap container CID: immediate navigation to CII</w:t>
+            </w:r>
+          </w:p>
+        </w:tc>
+        <w:tc>
+          <w:tcPr>
+            <w:tcW w:type="dxa" w:w="1417"/>
+            <w:shd w:fill="F0F0F5" w:val="clear"/>
+          </w:tcPr>
+          <w:p>
+            <w:pPr>
+              <w:jc w:val="center"/>
+            </w:pPr>
+          </w:p>
+        </w:tc>
+        <w:tc>
+          <w:tcPr>
+            <w:tcW w:type="dxa" w:w="3402"/>
+            <w:shd w:fill="F0F0F5" w:val="clear"/>
+          </w:tcPr>
+          <w:p/>
+        </w:tc>
+      </w:tr>
+      <w:tr>
+        <w:tc>
+          <w:tcPr>
+            <w:tcW w:type="dxa" w:w="454"/>
+          </w:tcPr>
+          <w:p>
+            <w:pPr>
+              <w:jc w:val="center"/>
+            </w:pPr>
+            <w:r>
+              <w:rPr>
+                <w:sz w:val="18"/>
+              </w:rPr>
+              <w:t>29</w:t>
+            </w:r>
+          </w:p>
+        </w:tc>
+        <w:tc>
+          <w:tcPr>
+            <w:tcW w:type="dxa" w:w="9071"/>
+          </w:tcPr>
+          <w:p>
+            <w:r>
+              <w:rPr>
+                <w:sz w:val="18"/>
+              </w:rPr>
+              <w:t>Back from CII returns to PRQ popup</w:t>
+            </w:r>
+          </w:p>
+        </w:tc>
+        <w:tc>
+          <w:tcPr>
+            <w:tcW w:type="dxa" w:w="1417"/>
+          </w:tcPr>
+          <w:p>
+            <w:pPr>
+              <w:jc w:val="center"/>
+            </w:pPr>
+          </w:p>
+        </w:tc>
+        <w:tc>
+          <w:tcPr>
+            <w:tcW w:type="dxa" w:w="3402"/>
+          </w:tcPr>
+          <w:p/>
+        </w:tc>
+      </w:tr>
+      <w:tr>
+        <w:tc>
+          <w:tcPr>
+            <w:tcW w:type="dxa" w:w="454"/>
+            <w:shd w:fill="F0F0F5" w:val="clear"/>
+          </w:tcPr>
+          <w:p>
+            <w:pPr>
+              <w:jc w:val="center"/>
+            </w:pPr>
+            <w:r>
+              <w:rPr>
+                <w:sz w:val="18"/>
+              </w:rPr>
+              <w:t>30</w:t>
+            </w:r>
+          </w:p>
+        </w:tc>
+        <w:tc>
+          <w:tcPr>
+            <w:tcW w:type="dxa" w:w="9071"/>
+            <w:shd w:fill="F0F0F5" w:val="clear"/>
+          </w:tcPr>
+          <w:p>
+            <w:r>
+              <w:rPr>
+                <w:sz w:val="18"/>
+              </w:rPr>
+              <w:t>Session persistence: filters/level survive navigate-away and back</w:t>
+            </w:r>
+          </w:p>
+        </w:tc>
+        <w:tc>
+          <w:tcPr>
+            <w:tcW w:type="dxa" w:w="1417"/>
+            <w:shd w:fill="F0F0F5" w:val="clear"/>
+          </w:tcPr>
+          <w:p>
+            <w:pPr>
+              <w:jc w:val="center"/>
+            </w:pPr>
+          </w:p>
+        </w:tc>
+        <w:tc>
+          <w:tcPr>
+            <w:tcW w:type="dxa" w:w="3402"/>
+            <w:shd w:fill="F0F0F5" w:val="clear"/>
+          </w:tcPr>
+          <w:p/>
+        </w:tc>
+      </w:tr>
+      <w:tr>
+        <w:tc>
+          <w:tcPr>
+            <w:tcW w:type="dxa" w:w="454"/>
+          </w:tcPr>
+          <w:p>
+            <w:pPr>
+              <w:jc w:val="center"/>
+            </w:pPr>
+            <w:r>
+              <w:rPr>
+                <w:sz w:val="18"/>
+              </w:rPr>
+              <w:t>31</w:t>
+            </w:r>
+          </w:p>
+        </w:tc>
+        <w:tc>
+          <w:tcPr>
+            <w:tcW w:type="dxa" w:w="9071"/>
+          </w:tcPr>
+          <w:p>
+            <w:r>
+              <w:rPr>
+                <w:sz w:val="18"/>
+              </w:rPr>
+              <w:t>No data: 'No pull data found' message at each level</w:t>
             </w:r>
           </w:p>
         </w:tc>

</xml_diff>